<commit_message>
Upgrade Vietnam NTM report: Minto structure, sharper exhibits, new cover
- Rewrite the text without inline inference labels; ABrighter estimates are
  described as such and their arithmetic stays in Appendix B
- SCQA executive summary, Minto pyramid exhibit and a key message per section
- Diagrams redrawn on a strict grid; all charts embedded as SVG with PNG fallback
- Duotone cover and back page from the ABrighter profile photo
- About page and contact details from the ABrighter company profile; Krungsri
  kept only as a cited data source

Co-Authored-By: Claude Opus 5.5 <noreply@anthropic.com>
Claude-Session: https://claude.ai/code/session_01VCwthevj8qD51hsW5qzMkw
</commit_message>
<xml_diff>
--- a/reports/vietnam-ntm-2026/ABrighter_NTM_Vietnam_2026.docx
+++ b/reports/vietnam-ntm-2026/ABrighter_NTM_Vietnam_2026.docx
@@ -176,7 +176,7 @@
           <w:sz w:val="22"/>
           <w:szCs w:val="22"/>
         </w:rPr>
-        <w:t xml:space="preserve">	4</w:t>
+        <w:t xml:space="preserve">	5</w:t>
       </w:r>
     </w:p>
     <w:p>
@@ -217,7 +217,7 @@
           <w:sz w:val="22"/>
           <w:szCs w:val="22"/>
         </w:rPr>
-        <w:t xml:space="preserve">	5</w:t>
+        <w:t xml:space="preserve">	6</w:t>
       </w:r>
     </w:p>
     <w:p>
@@ -258,7 +258,7 @@
           <w:sz w:val="22"/>
           <w:szCs w:val="22"/>
         </w:rPr>
-        <w:t xml:space="preserve">	8</w:t>
+        <w:t xml:space="preserve">	9</w:t>
       </w:r>
     </w:p>
     <w:p>
@@ -564,24 +564,21 @@
             </w:pPr>
             <w:r>
               <w:rPr>
+                <w:b/>
+                <w:bCs/>
                 <w:color w:val="FFFFFF"/>
                 <w:sz w:val="19"/>
                 <w:szCs w:val="19"/>
               </w:rPr>
-              <w:t xml:space="preserve">Non-tariff measures (NTMs) have become the main instrument of trade policy in Vietnam's key markets. The European Union (EU) stands out. It applies NTMs to 99% of its import product lines and has turned its climate and land-use goals into border rules through the Carbon Border Adjustment Mechanism (CBAM) and the EU Deforestation Regulation (EUDR). Both bear directly on products that Vietnam sells to Europe.</w:t>
-            </w:r>
-          </w:p>
-          <w:p>
-            <w:pPr>
-              <w:spacing w:after="160" w:line="290"/>
-            </w:pPr>
+              <w:t xml:space="preserve">Situation.</w:t>
+            </w:r>
             <w:r>
               <w:rPr>
                 <w:color w:val="FFFFFF"/>
                 <w:sz w:val="19"/>
                 <w:szCs w:val="19"/>
               </w:rPr>
-              <w:t xml:space="preserve">Among the five largest ASEAN economies Vietnam is the most exposed. Exports to the EU reached USD 56.2 billion in 2025 (10.9% of GDP). They grew by a further 16.3% in the first half of 2026. About four fifths of that trade falls in product groups where NTMs raise costs most. Vietnam also has the highest share of metal products in its exports to the EU (18.8%), which makes it the ASEAN economy most dependent on CBAM-covered goods. Coffee, wood and rubber bring it inside the scope of the EUDR from 30 December 2026.</w:t>
+              <w:t xml:space="preserve"> Non-tariff measures (NTMs) have replaced tariffs as the main instrument of trade policy in Vietnam's key markets. The European Union (EU) leads the shift. It applies NTMs to 99% of its import product lines and has turned its climate and land-use goals into border rules through the Carbon Border Adjustment Mechanism (CBAM) and the EU Deforestation Regulation (EUDR).</w:t>
             </w:r>
           </w:p>
           <w:p>
@@ -592,50 +589,65 @@
               <w:rPr>
                 <w:b/>
                 <w:bCs/>
-                <w:color w:val="99C2FF"/>
-                <w:sz w:val="15"/>
-                <w:szCs w:val="15"/>
-              </w:rPr>
-              <w:t xml:space="preserve">[Inference]</w:t>
-            </w:r>
-            <w:r>
-              <w:rPr>
                 <w:color w:val="FFFFFF"/>
                 <w:sz w:val="19"/>
                 <w:szCs w:val="19"/>
               </w:rPr>
-              <w:t xml:space="preserve"> Compliance raises costs at every stage of the chain: upgrading production, measuring and verifying emissions and tracing raw materials to the plot. Applied to 2025 values the NTM-sensitive share of exports to the EU is worth about USD 45.7 billion, or 8.9% of GDP. On today's steel volumes an illustrative CBAM bill rises from about EUR 10 million in 2026 to about EUR 407 million a year at full phase-in in 2034 unless emission intensity falls.</w:t>
-            </w:r>
-          </w:p>
-          <w:p>
-            <w:pPr>
-              <w:spacing w:after="160" w:line="290"/>
-            </w:pPr>
+              <w:t xml:space="preserve">Complication.</w:t>
+            </w:r>
             <w:r>
               <w:rPr>
                 <w:color w:val="FFFFFF"/>
                 <w:sz w:val="19"/>
                 <w:szCs w:val="19"/>
               </w:rPr>
-              <w:t xml:space="preserve">Vietnam has started to adapt. It has amended its product quality law to require digital certification and traceability, launched a pilot carbon market, issued a Green Taxonomy and raised its renewable energy targets. </w:t>
-            </w:r>
+              <w:t xml:space="preserve"> No large ASEAN economy depends on Europe as much as Vietnam. Exports to the EU reached USD 56.2 billion in 2025 (10.9% of GDP) and grew by a further 16.3% in the first half of 2026. About four fifths of that trade sits in product groups where NTMs raise costs most. Metals make up 18.8% of exports to the EU, the highest share in the region, while coffee, wood and rubber bring Vietnam inside the EUDR from 30 December 2026.</w:t>
+            </w:r>
+          </w:p>
+          <w:p>
+            <w:pPr>
+              <w:spacing w:after="160" w:line="290"/>
+            </w:pPr>
             <w:r>
               <w:rPr>
                 <w:b/>
                 <w:bCs/>
-                <w:color w:val="99C2FF"/>
-                <w:sz w:val="15"/>
-                <w:szCs w:val="15"/>
-              </w:rPr>
-              <w:t xml:space="preserve">[Inference]</w:t>
-            </w:r>
-            <w:r>
-              <w:rPr>
                 <w:color w:val="FFFFFF"/>
                 <w:sz w:val="19"/>
                 <w:szCs w:val="19"/>
               </w:rPr>
-              <w:t xml:space="preserve"> The binding constraint has now moved from legislation to delivery. We believe firms will need capital and skills to upgrade production. The Government will need to support them with incentives, clean energy infrastructure and verification systems that the EU recognises.</w:t>
+              <w:t xml:space="preserve">Question.</w:t>
+            </w:r>
+            <w:r>
+              <w:rPr>
+                <w:color w:val="FFFFFF"/>
+                <w:sz w:val="19"/>
+                <w:szCs w:val="19"/>
+              </w:rPr>
+              <w:t xml:space="preserve"> How large is the exposure, where does it bite and what must Vietnam do to keep its place in the European market?</w:t>
+            </w:r>
+          </w:p>
+          <w:p>
+            <w:pPr>
+              <w:spacing w:after="160" w:line="290"/>
+            </w:pPr>
+            <w:r>
+              <w:rPr>
+                <w:b/>
+                <w:bCs/>
+                <w:color w:val="FFFFFF"/>
+                <w:sz w:val="19"/>
+                <w:szCs w:val="19"/>
+              </w:rPr>
+              <w:t xml:space="preserve">Answer.</w:t>
+            </w:r>
+            <w:r>
+              <w:rPr>
+                <w:color w:val="FFFFFF"/>
+                <w:sz w:val="19"/>
+                <w:szCs w:val="19"/>
+              </w:rPr>
+              <w:t xml:space="preserve"> By our estimate about USD 45.7 billion of exports to the EU, or 8.9% of GDP, sits in NTM-sensitive groups. On today's steel volumes the CBAM bill rises from about EUR 10 million in 2026 to about EUR 407 million a year in 2034 unless emissions fall. Vietnam has already written most of the required instruments into law. The constraint now is delivery: verified emissions data, plot-level traceability, clean power and the capital to upgrade. We believe the next 18 months will decide whether these rules become a wall or a bridge for Vietnamese exporters.</w:t>
             </w:r>
           </w:p>
         </w:tc>
@@ -963,6 +975,204 @@
     </w:tbl>
     <w:p>
       <w:pPr>
+        <w:pBdr>
+          <w:top w:val="single" w:color="C5CDD5" w:sz="4" w:space="10"/>
+        </w:pBdr>
+        <w:spacing w:after="40" w:before="360"/>
+      </w:pPr>
+      <w:r>
+        <w:rPr>
+          <w:b/>
+          <w:bCs/>
+          <w:color w:val="2251FF"/>
+          <w:spacing w:val="30"/>
+          <w:sz w:val="14"/>
+          <w:szCs w:val="14"/>
+        </w:rPr>
+        <w:t xml:space="preserve">PREPARED BY</w:t>
+      </w:r>
+    </w:p>
+    <w:p>
+      <w:pPr>
+        <w:spacing w:after="20"/>
+      </w:pPr>
+      <w:r>
+        <w:rPr>
+          <w:rFonts w:ascii="Georgia" w:cs="Georgia" w:eastAsia="Georgia" w:hAnsi="Georgia"/>
+          <w:b/>
+          <w:bCs/>
+          <w:color w:val="051C2C"/>
+          <w:sz w:val="24"/>
+          <w:szCs w:val="24"/>
+        </w:rPr>
+        <w:t xml:space="preserve">Le Dinh Thang (Alex), MA, Adv PA</w:t>
+      </w:r>
+    </w:p>
+    <w:p>
+      <w:pPr>
+        <w:spacing w:after="20"/>
+      </w:pPr>
+      <w:r>
+        <w:rPr>
+          <w:color w:val="6B7785"/>
+          <w:sz w:val="16"/>
+          <w:szCs w:val="16"/>
+        </w:rPr>
+        <w:t xml:space="preserve">Managing Partner, Partner and Advisory Services Leader, ABrighter</w:t>
+      </w:r>
+    </w:p>
+    <w:p>
+      <w:pPr>
+        <w:spacing w:after="0"/>
+      </w:pPr>
+      <w:r>
+        <w:rPr>
+          <w:color w:val="2251FF"/>
+          <w:sz w:val="16"/>
+          <w:szCs w:val="16"/>
+        </w:rPr>
+        <w:t xml:space="preserve">thang.le@abrighterconsultancy.com  |  +84 90 338 5558</w:t>
+      </w:r>
+    </w:p>
+    <w:p>
+      <w:pPr>
+        <w:keepNext/>
+        <w:pageBreakBefore/>
+        <w:spacing w:after="40" w:before="0"/>
+      </w:pPr>
+      <w:r>
+        <w:rPr>
+          <w:rFonts w:ascii="Arial" w:cs="Arial" w:eastAsia="Arial" w:hAnsi="Arial"/>
+          <w:b/>
+          <w:bCs/>
+          <w:color w:val="2251FF"/>
+          <w:spacing w:val="30"/>
+          <w:sz w:val="15"/>
+          <w:szCs w:val="15"/>
+        </w:rPr>
+        <w:t xml:space="preserve">EXHIBIT 1</w:t>
+      </w:r>
+    </w:p>
+    <w:p>
+      <w:pPr>
+        <w:keepNext/>
+        <w:pBdr>
+          <w:bottom w:val="single" w:color="051C2C" w:sz="6" w:space="4"/>
+        </w:pBdr>
+        <w:spacing w:after="100"/>
+      </w:pPr>
+      <w:r>
+        <w:rPr>
+          <w:rFonts w:ascii="Arial" w:cs="Arial" w:eastAsia="Arial" w:hAnsi="Arial"/>
+          <w:b/>
+          <w:bCs/>
+          <w:color w:val="051C2C"/>
+          <w:sz w:val="21"/>
+          <w:szCs w:val="21"/>
+        </w:rPr>
+        <w:t xml:space="preserve">The argument on one page: Vietnam's exposure is the price of its success in Europe</w:t>
+      </w:r>
+    </w:p>
+    <w:p>
+      <w:pPr>
+        <w:keepNext/>
+        <w:spacing w:after="80"/>
+      </w:pPr>
+      <w:r>
+        <w:drawing>
+          <wp:inline distT="0" distB="0" distL="0" distR="0">
+            <wp:extent cx="6115050" cy="3829050"/>
+            <wp:effectExtent t="0" r="0" b="0" l="0"/>
+            <wp:docPr id="1" name="" descr="" title=""/>
+            <wp:cNvGraphicFramePr>
+              <a:graphicFrameLocks xmlns:a="http://schemas.openxmlformats.org/drawingml/2006/main" noChangeAspect="1"/>
+            </wp:cNvGraphicFramePr>
+            <a:graphic xmlns:a="http://schemas.openxmlformats.org/drawingml/2006/main">
+              <a:graphicData uri="http://schemas.openxmlformats.org/drawingml/2006/picture">
+                <pic:pic xmlns:pic="http://schemas.openxmlformats.org/drawingml/2006/picture">
+                  <pic:nvPicPr>
+                    <pic:cNvPr id="0" name="" descr=""/>
+                    <pic:cNvPicPr>
+                      <a:picLocks noChangeAspect="1" noChangeArrowheads="1"/>
+                    </pic:cNvPicPr>
+                  </pic:nvPicPr>
+                  <pic:blipFill>
+                    <a:blip r:embed="rId18" cstate="none">
+                      <a:extLst>
+                        <a:ext uri="{96DAC541-7B7A-43D3-8B79-37D633B846F1}">
+                          <asvg:svgBlip xmlns:asvg="http://schemas.microsoft.com/office/drawing/2016/SVG/main" r:embed="rId17"/>
+                        </a:ext>
+                      </a:extLst>
+                    </a:blip>
+                    <a:srcRect/>
+                    <a:stretch>
+                      <a:fillRect/>
+                    </a:stretch>
+                  </pic:blipFill>
+                  <pic:spPr bwMode="auto">
+                    <a:xfrm>
+                      <a:off x="0" y="0"/>
+                      <a:ext cx="6115050" cy="3829050"/>
+                    </a:xfrm>
+                    <a:prstGeom prst="rect">
+                      <a:avLst/>
+                    </a:prstGeom>
+                  </pic:spPr>
+                </pic:pic>
+              </a:graphicData>
+            </a:graphic>
+          </wp:inline>
+        </w:drawing>
+      </w:r>
+    </w:p>
+    <w:p>
+      <w:pPr>
+        <w:spacing w:after="20"/>
+      </w:pPr>
+      <w:r>
+        <w:rPr>
+          <w:b/>
+          <w:bCs/>
+          <w:color w:val="6B7785"/>
+          <w:sz w:val="14"/>
+          <w:szCs w:val="14"/>
+        </w:rPr>
+        <w:t xml:space="preserve">Notes: </w:t>
+      </w:r>
+      <w:r>
+        <w:rPr>
+          <w:color w:val="6B7785"/>
+          <w:sz w:val="14"/>
+          <w:szCs w:val="14"/>
+        </w:rPr>
+        <w:t xml:space="preserve">Structured as a Minto pyramid: the governing thought at the top, three supporting arguments and the evidence beneath each. Figures refer to 2024 shares and 2025 values unless stated.</w:t>
+      </w:r>
+    </w:p>
+    <w:p>
+      <w:pPr>
+        <w:spacing w:after="220"/>
+      </w:pPr>
+      <w:r>
+        <w:rPr>
+          <w:b/>
+          <w:bCs/>
+          <w:color w:val="6B7785"/>
+          <w:sz w:val="14"/>
+          <w:szCs w:val="14"/>
+        </w:rPr>
+        <w:t xml:space="preserve">Source: </w:t>
+      </w:r>
+      <w:r>
+        <w:rPr>
+          <w:color w:val="6B7785"/>
+          <w:sz w:val="14"/>
+          <w:szCs w:val="14"/>
+        </w:rPr>
+        <w:t xml:space="preserve">ABrighter Research</w:t>
+      </w:r>
+    </w:p>
+    <w:p>
+      <w:pPr>
         <w:pageBreakBefore/>
         <w:spacing w:after="0"/>
       </w:pPr>
@@ -1001,131 +1211,6 @@
           <w:szCs w:val="10"/>
         </w:rPr>
         <w:t xml:space="preserve">██████</w:t>
-      </w:r>
-    </w:p>
-    <w:p>
-      <w:pPr>
-        <w:spacing w:after="140" w:line="288"/>
-      </w:pPr>
-      <w:r>
-        <w:rPr>
-          <w:sz w:val="20"/>
-          <w:szCs w:val="20"/>
-        </w:rPr>
-        <w:t xml:space="preserve">Tariffs have fallen for three decades while the rules behind them have multiplied. Since the World Trade Organization (WTO) was founded in 1995 its members have cut barriers to trade through bilateral and multilateral agreements. As a result the global average import tariff fell from around 8% in 2002 to 4% in 2021.</w:t>
-      </w:r>
-      <w:r>
-        <w:rPr>
-          <w:rStyle w:val="FootnoteReference"/>
-        </w:rPr>
-        <w:footnoteReference w:id="1"/>
-      </w:r>
-      <w:r>
-        <w:rPr>
-          <w:sz w:val="20"/>
-          <w:szCs w:val="20"/>
-        </w:rPr>
-        <w:t xml:space="preserve"> Over the same period importing economies turned increasingly to NTMs as a substitute instrument. UNCTAD (2024) found that the cost of complying with NTMs has exceeded the cost of tariffs in recent years.</w:t>
-      </w:r>
-    </w:p>
-    <w:p>
-      <w:pPr>
-        <w:spacing w:after="140" w:line="288"/>
-      </w:pPr>
-      <w:r>
-        <w:rPr>
-          <w:sz w:val="20"/>
-          <w:szCs w:val="20"/>
-        </w:rPr>
-        <w:t xml:space="preserve">Vietnam's own history follows the same arc. It joined the WTO in 2007. On 1 August 2020 the EU-Vietnam Free Trade Agreement (EVFTA) entered into force and began to remove most EU tariffs on Vietnamese goods. From that point forward exports kept climbing and reached USD 475.0 billion in 2025.</w:t>
-      </w:r>
-      <w:r>
-        <w:rPr>
-          <w:rStyle w:val="FootnoteReference"/>
-        </w:rPr>
-        <w:footnoteReference w:id="2"/>
-      </w:r>
-      <w:r>
-        <w:rPr>
-          <w:sz w:val="20"/>
-          <w:szCs w:val="20"/>
-        </w:rPr>
-        <w:t xml:space="preserve"> That placed Vietnam 18th among the world's merchandise exporters.</w:t>
-      </w:r>
-      <w:r>
-        <w:rPr>
-          <w:rStyle w:val="FootnoteReference"/>
-        </w:rPr>
-        <w:footnoteReference w:id="3"/>
-      </w:r>
-      <w:r>
-        <w:rPr>
-          <w:sz w:val="20"/>
-          <w:szCs w:val="20"/>
-        </w:rPr>
-        <w:t xml:space="preserve"> As the tariff walls came down a different set of gates went up: standards, certificates, traceability files and carbon accounts.</w:t>
-      </w:r>
-    </w:p>
-    <w:p>
-      <w:pPr>
-        <w:spacing w:after="140" w:line="288"/>
-      </w:pPr>
-      <w:r>
-        <w:rPr>
-          <w:sz w:val="20"/>
-          <w:szCs w:val="20"/>
-        </w:rPr>
-        <w:t xml:space="preserve">Tariffs have also returned. Since Donald Trump began his second presidential term in 2025 the United States has raised import duties on most of its partners, Vietnam included. An additional duty of 46% was announced in April 2025 before a rate of 20% took effect in August.</w:t>
-      </w:r>
-      <w:r>
-        <w:rPr>
-          <w:rStyle w:val="FootnoteReference"/>
-        </w:rPr>
-        <w:footnoteReference w:id="4"/>
-      </w:r>
-      <w:r>
-        <w:rPr>
-          <w:sz w:val="20"/>
-          <w:szCs w:val="20"/>
-        </w:rPr>
-        <w:t xml:space="preserve"> These tariff costs come on top of NTM compliance costs that were already rising. For Vietnam the two now act together on the same exporters.</w:t>
-      </w:r>
-    </w:p>
-    <w:p>
-      <w:pPr>
-        <w:spacing w:after="140" w:line="288"/>
-      </w:pPr>
-      <w:r>
-        <w:rPr>
-          <w:sz w:val="20"/>
-          <w:szCs w:val="20"/>
-        </w:rPr>
-        <w:t xml:space="preserve">Major economies, including the United States, China, Japan and the EU, use NTMs both to protect domestic industry and to raise product standards and pursue sustainability goals. The EU has played a particularly prominent role. It enforces its NTMs under strict requirements and clear timelines with the aim of protecting its market through harmonised quality standards. Because the EU is one of Vietnam's three largest export markets, these measures bear directly on Vietnam's exports and on the wider economy.</w:t>
-      </w:r>
-    </w:p>
-    <w:p>
-      <w:pPr>
-        <w:spacing w:after="140" w:line="288"/>
-      </w:pPr>
-      <w:r>
-        <w:rPr>
-          <w:sz w:val="20"/>
-          <w:szCs w:val="20"/>
-        </w:rPr>
-        <w:t xml:space="preserve">This report examines the EU's NTMs and their impact on Vietnam. It builds on the regional study by Krungsri Research (2026), which compared Thailand, Indonesia, the Philippines, Vietnam and Malaysia and found Vietnam the most exposed of the five.</w:t>
-      </w:r>
-      <w:r>
-        <w:rPr>
-          <w:rStyle w:val="FootnoteReference"/>
-        </w:rPr>
-        <w:footnoteReference w:id="5"/>
-      </w:r>
-      <w:r>
-        <w:rPr>
-          <w:sz w:val="20"/>
-          <w:szCs w:val="20"/>
-        </w:rPr>
-        <w:t xml:space="preserve"> We reinterpret those findings for Vietnam, update the data to 30 June 2026 and explain the mechanisms in more depth. The analysis has three parts: (1) an overview of how the EU applies NTMs, (2) an analysis of their impact on Vietnam and (3) a summary of impact levels and policy responses. It closes with the ABrighter Research view.</w:t>
       </w:r>
     </w:p>
     <w:tbl>
@@ -1149,53 +1234,100 @@
             <w:tcW w:type="dxa" w:w="9638"/>
             <w:tcBorders>
               <w:top w:val="none" w:color="FFFFFF" w:sz="0"/>
-              <w:left w:val="single" w:color="051C2C" w:sz="18"/>
+              <w:left w:val="single" w:color="2251FF" w:sz="24"/>
               <w:bottom w:val="none" w:color="FFFFFF" w:sz="0"/>
               <w:right w:val="none" w:color="FFFFFF" w:sz="0"/>
             </w:tcBorders>
-            <w:shd w:fill="EEF1F4" w:color="auto" w:val="clear"/>
-            <w:tcMar>
-              <w:top w:type="dxa" w:w="160"/>
-              <w:left w:type="dxa" w:w="200"/>
-              <w:bottom w:type="dxa" w:w="100"/>
-              <w:right w:type="dxa" w:w="200"/>
-            </w:tcMar>
-          </w:tcPr>
-          <w:p>
-            <w:pPr>
-              <w:spacing w:after="40" w:line="264"/>
-            </w:pPr>
-            <w:r>
-              <w:rPr>
-                <w:i/>
-                <w:iCs/>
-                <w:color w:val="051C2C"/>
-                <w:sz w:val="16"/>
-                <w:szCs w:val="16"/>
-              </w:rPr>
-              <w:t xml:space="preserve">Data cut-off. Figures run to 30 June 2026 unless marked otherwise. Peer comparisons use the 2024 data in Krungsri Research (2026) so that all five economies are measured on the same basis. Derived figures carry the label </w:t>
-            </w:r>
+            <w:shd w:fill="EEF3FF" w:color="auto" w:val="clear"/>
+            <w:tcMar>
+              <w:top w:type="dxa" w:w="240"/>
+              <w:left w:type="dxa" w:w="280"/>
+              <w:bottom w:type="dxa" w:w="180"/>
+              <w:right w:type="dxa" w:w="280"/>
+            </w:tcMar>
+          </w:tcPr>
+          <w:p>
+            <w:pPr>
+              <w:spacing w:after="80"/>
+            </w:pPr>
             <w:r>
               <w:rPr>
                 <w:b/>
                 <w:bCs/>
-                <w:i/>
-                <w:iCs/>
                 <w:color w:val="2251FF"/>
-                <w:sz w:val="15"/>
-                <w:szCs w:val="15"/>
-              </w:rPr>
-              <w:t xml:space="preserve">[Inference]</w:t>
-            </w:r>
-            <w:r>
-              <w:rPr>
-                <w:i/>
-                <w:iCs/>
+                <w:spacing w:val="40"/>
+                <w:sz w:val="15"/>
+                <w:szCs w:val="15"/>
+              </w:rPr>
+              <w:t xml:space="preserve">KEY MESSAGE</w:t>
+            </w:r>
+          </w:p>
+          <w:p>
+            <w:pPr>
+              <w:spacing w:after="140" w:line="290"/>
+            </w:pPr>
+            <w:r>
+              <w:rPr>
+                <w:rFonts w:ascii="Georgia" w:cs="Georgia" w:eastAsia="Georgia" w:hAnsi="Georgia"/>
                 <w:color w:val="051C2C"/>
-                <w:sz w:val="16"/>
-                <w:szCs w:val="16"/>
-              </w:rPr>
-              <w:t xml:space="preserve"> and their arithmetic is set out in Appendix B.</w:t>
+                <w:sz w:val="25"/>
+                <w:szCs w:val="25"/>
+              </w:rPr>
+              <w:t xml:space="preserve">As tariff walls came down a different set of gates went up. For Vietnam the EU now operates the most demanding of them.</w:t>
+            </w:r>
+          </w:p>
+          <w:p>
+            <w:pPr>
+              <w:pStyle w:val="ListParagraph"/>
+              <w:numPr>
+                <w:ilvl w:val="0"/>
+                <w:numId w:val="2"/>
+              </w:numPr>
+              <w:spacing w:after="70" w:line="264"/>
+            </w:pPr>
+            <w:r>
+              <w:rPr>
+                <w:color w:val="051C2C"/>
+                <w:sz w:val="18"/>
+                <w:szCs w:val="18"/>
+              </w:rPr>
+              <w:t xml:space="preserve">Tariffs fell by half between 2002 and 2021 while compliance costs from NTMs overtook tariff costs.</w:t>
+            </w:r>
+          </w:p>
+          <w:p>
+            <w:pPr>
+              <w:pStyle w:val="ListParagraph"/>
+              <w:numPr>
+                <w:ilvl w:val="0"/>
+                <w:numId w:val="2"/>
+              </w:numPr>
+              <w:spacing w:after="70" w:line="264"/>
+            </w:pPr>
+            <w:r>
+              <w:rPr>
+                <w:color w:val="051C2C"/>
+                <w:sz w:val="18"/>
+                <w:szCs w:val="18"/>
+              </w:rPr>
+              <w:t xml:space="preserve">Vietnam's export success under the EVFTA has made it the ASEAN economy most exposed to EU rules.</w:t>
+            </w:r>
+          </w:p>
+          <w:p>
+            <w:pPr>
+              <w:pStyle w:val="ListParagraph"/>
+              <w:numPr>
+                <w:ilvl w:val="0"/>
+                <w:numId w:val="2"/>
+              </w:numPr>
+              <w:spacing w:after="70" w:line="264"/>
+            </w:pPr>
+            <w:r>
+              <w:rPr>
+                <w:color w:val="051C2C"/>
+                <w:sz w:val="18"/>
+                <w:szCs w:val="18"/>
+              </w:rPr>
+              <w:t xml:space="preserve">This report measures that exposure on three dimensions and sets out what Vietnam needs to do next.</w:t>
             </w:r>
           </w:p>
         </w:tc>
@@ -1203,8 +1335,133 @@
     </w:tbl>
     <w:p>
       <w:pPr>
-        <w:spacing w:after="200"/>
-      </w:pPr>
+        <w:spacing w:after="220"/>
+      </w:pPr>
+    </w:p>
+    <w:p>
+      <w:pPr>
+        <w:spacing w:after="140" w:line="288"/>
+      </w:pPr>
+      <w:r>
+        <w:rPr>
+          <w:sz w:val="20"/>
+          <w:szCs w:val="20"/>
+        </w:rPr>
+        <w:t xml:space="preserve">Tariffs have fallen for three decades while the rules behind them have multiplied. Since the World Trade Organization (WTO) was founded in 1995 its members have cut barriers to trade through bilateral and multilateral agreements. The global average import tariff fell from around 8% in 2002 to 4% in 2021.</w:t>
+      </w:r>
+      <w:r>
+        <w:rPr>
+          <w:rStyle w:val="FootnoteReference"/>
+        </w:rPr>
+        <w:footnoteReference w:id="1"/>
+      </w:r>
+      <w:r>
+        <w:rPr>
+          <w:sz w:val="20"/>
+          <w:szCs w:val="20"/>
+        </w:rPr>
+        <w:t xml:space="preserve"> Over the same period importing economies turned increasingly to NTMs as a substitute instrument. UNCTAD (2024) found that the cost of complying with NTMs has exceeded the cost of tariffs in recent years.</w:t>
+      </w:r>
+    </w:p>
+    <w:p>
+      <w:pPr>
+        <w:spacing w:after="140" w:line="288"/>
+      </w:pPr>
+      <w:r>
+        <w:rPr>
+          <w:sz w:val="20"/>
+          <w:szCs w:val="20"/>
+        </w:rPr>
+        <w:t xml:space="preserve">Vietnam's own history follows the same arc. It joined the WTO in 2007. On 1 August 2020 the EU-Vietnam Free Trade Agreement (EVFTA) entered into force and began to remove most EU tariffs on Vietnamese goods. From that point forward exports kept climbing and reached USD 475.0 billion in 2025.</w:t>
+      </w:r>
+      <w:r>
+        <w:rPr>
+          <w:rStyle w:val="FootnoteReference"/>
+        </w:rPr>
+        <w:footnoteReference w:id="2"/>
+      </w:r>
+      <w:r>
+        <w:rPr>
+          <w:sz w:val="20"/>
+          <w:szCs w:val="20"/>
+        </w:rPr>
+        <w:t xml:space="preserve"> That placed Vietnam 18th among the world's merchandise exporters.</w:t>
+      </w:r>
+      <w:r>
+        <w:rPr>
+          <w:rStyle w:val="FootnoteReference"/>
+        </w:rPr>
+        <w:footnoteReference w:id="3"/>
+      </w:r>
+      <w:r>
+        <w:rPr>
+          <w:sz w:val="20"/>
+          <w:szCs w:val="20"/>
+        </w:rPr>
+        <w:t xml:space="preserve"> As the tariff walls came down a different set of gates went up: standards, certificates, traceability files and carbon accounts.</w:t>
+      </w:r>
+    </w:p>
+    <w:p>
+      <w:pPr>
+        <w:spacing w:after="140" w:line="288"/>
+      </w:pPr>
+      <w:r>
+        <w:rPr>
+          <w:sz w:val="20"/>
+          <w:szCs w:val="20"/>
+        </w:rPr>
+        <w:t xml:space="preserve">Tariffs have also returned. Since Donald Trump began his second presidential term in 2025 the United States has raised import duties on most of its partners, Vietnam included. An additional duty of 46% was announced in April 2025 before a rate of 20% took effect in August.</w:t>
+      </w:r>
+      <w:r>
+        <w:rPr>
+          <w:rStyle w:val="FootnoteReference"/>
+        </w:rPr>
+        <w:footnoteReference w:id="4"/>
+      </w:r>
+      <w:r>
+        <w:rPr>
+          <w:sz w:val="20"/>
+          <w:szCs w:val="20"/>
+        </w:rPr>
+        <w:t xml:space="preserve"> These tariff costs sit on top of NTM compliance costs that were already rising. For Vietnamese exporters the two now act together.</w:t>
+      </w:r>
+    </w:p>
+    <w:p>
+      <w:pPr>
+        <w:spacing w:after="140" w:line="288"/>
+      </w:pPr>
+      <w:r>
+        <w:rPr>
+          <w:sz w:val="20"/>
+          <w:szCs w:val="20"/>
+        </w:rPr>
+        <w:t xml:space="preserve">Major economies, including the United States, China, Japan and the EU, use NTMs both to protect domestic industry and to raise standards and pursue sustainability goals. The EU plays the most prominent role. It enforces its NTMs under strict requirements and clear timelines with the aim of protecting its market through harmonised quality standards. Because the EU is one of Vietnam's three largest export markets, these measures bear directly on Vietnam's exports and on the wider economy.</w:t>
+      </w:r>
+    </w:p>
+    <w:p>
+      <w:pPr>
+        <w:spacing w:after="140" w:line="288"/>
+      </w:pPr>
+      <w:r>
+        <w:rPr>
+          <w:sz w:val="20"/>
+          <w:szCs w:val="20"/>
+        </w:rPr>
+        <w:t xml:space="preserve">This report therefore examines the EU's NTMs and their impact on Vietnam. It compares Vietnam with Thailand, Indonesia, the Philippines and Malaysia on a common 2024 dataset.</w:t>
+      </w:r>
+      <w:r>
+        <w:rPr>
+          <w:rStyle w:val="FootnoteReference"/>
+        </w:rPr>
+        <w:footnoteReference w:id="5"/>
+      </w:r>
+      <w:r>
+        <w:rPr>
+          <w:sz w:val="20"/>
+          <w:szCs w:val="20"/>
+        </w:rPr>
+        <w:t xml:space="preserve"> It then updates the picture for Vietnam to 30 June 2026 (the data cut-off for this report) and explains the mechanisms behind each result. The analysis has three parts: (1) an overview of how the EU applies NTMs, (2) an analysis of their impact on Vietnam and (3) a summary of impact levels and policy responses. It closes with the ABrighter Research view.</w:t>
+      </w:r>
     </w:p>
     <w:p>
       <w:pPr>
@@ -1275,26 +1532,40 @@
             </w:tcBorders>
             <w:shd w:fill="EEF3FF" w:color="auto" w:val="clear"/>
             <w:tcMar>
-              <w:top w:type="dxa" w:w="220"/>
-              <w:left w:type="dxa" w:w="260"/>
-              <w:bottom w:type="dxa" w:w="160"/>
-              <w:right w:type="dxa" w:w="260"/>
-            </w:tcMar>
-          </w:tcPr>
-          <w:p>
-            <w:pPr>
-              <w:spacing w:after="100"/>
+              <w:top w:type="dxa" w:w="240"/>
+              <w:left w:type="dxa" w:w="280"/>
+              <w:bottom w:type="dxa" w:w="180"/>
+              <w:right w:type="dxa" w:w="280"/>
+            </w:tcMar>
+          </w:tcPr>
+          <w:p>
+            <w:pPr>
+              <w:spacing w:after="80"/>
             </w:pPr>
             <w:r>
               <w:rPr>
                 <w:b/>
                 <w:bCs/>
                 <w:color w:val="2251FF"/>
-                <w:spacing w:val="30"/>
-                <w:sz w:val="16"/>
-                <w:szCs w:val="16"/>
-              </w:rPr>
-              <w:t xml:space="preserve">AT A GLANCE</w:t>
+                <w:spacing w:val="40"/>
+                <w:sz w:val="15"/>
+                <w:szCs w:val="15"/>
+              </w:rPr>
+              <w:t xml:space="preserve">KEY MESSAGE</w:t>
+            </w:r>
+          </w:p>
+          <w:p>
+            <w:pPr>
+              <w:spacing w:after="140" w:line="290"/>
+            </w:pPr>
+            <w:r>
+              <w:rPr>
+                <w:rFonts w:ascii="Georgia" w:cs="Georgia" w:eastAsia="Georgia" w:hAnsi="Georgia"/>
+                <w:color w:val="051C2C"/>
+                <w:sz w:val="25"/>
+                <w:szCs w:val="25"/>
+              </w:rPr>
+              <w:t xml:space="preserve">The EU applies NTMs to almost everything it imports and keeps raising the bar product group by product group.</w:t>
             </w:r>
           </w:p>
           <w:p>
@@ -1304,7 +1575,7 @@
                 <w:ilvl w:val="0"/>
                 <w:numId w:val="2"/>
               </w:numPr>
-              <w:spacing w:after="80" w:line="270"/>
+              <w:spacing w:after="70" w:line="264"/>
             </w:pPr>
             <w:r>
               <w:rPr>
@@ -1312,7 +1583,7 @@
                 <w:sz w:val="18"/>
                 <w:szCs w:val="18"/>
               </w:rPr>
-              <w:t xml:space="preserve">The EU applies NTMs to 99% of its import product lines and 98% of import value, more than China or the United States.</w:t>
+              <w:t xml:space="preserve">NTMs cover 99% of EU import lines and 98% of import value, more than in China or the United States.</w:t>
             </w:r>
           </w:p>
           <w:p>
@@ -1322,7 +1593,7 @@
                 <w:ilvl w:val="0"/>
                 <w:numId w:val="2"/>
               </w:numPr>
-              <w:spacing w:after="80" w:line="270"/>
+              <w:spacing w:after="70" w:line="264"/>
             </w:pPr>
             <w:r>
               <w:rPr>
@@ -1330,7 +1601,7 @@
                 <w:sz w:val="18"/>
                 <w:szCs w:val="18"/>
               </w:rPr>
-              <w:t xml:space="preserve">These three markets took 58.9% of Vietnam's exports in 2025, so almost everything Vietnam sells abroad meets an NTM somewhere.</w:t>
+              <w:t xml:space="preserve">Those three markets took 58.9% of Vietnam's exports in 2025, so almost every Vietnamese export meets an NTM somewhere.</w:t>
             </w:r>
           </w:p>
           <w:p>
@@ -1340,7 +1611,7 @@
                 <w:ilvl w:val="0"/>
                 <w:numId w:val="2"/>
               </w:numPr>
-              <w:spacing w:after="80" w:line="270"/>
+              <w:spacing w:after="70" w:line="264"/>
             </w:pPr>
             <w:r>
               <w:rPr>
@@ -1348,7 +1619,7 @@
                 <w:sz w:val="18"/>
                 <w:szCs w:val="18"/>
               </w:rPr>
-              <w:t xml:space="preserve">The EU's distinctive feature is breadth: it raises standards across whole product groups and to fixed timelines.</w:t>
+              <w:t xml:space="preserve">Three EU measures matter most for Vietnam: CBAM, the EUDR and residue limits on food.</w:t>
             </w:r>
           </w:p>
         </w:tc>
@@ -1356,7 +1627,7 @@
     </w:tbl>
     <w:p>
       <w:pPr>
-        <w:spacing w:after="200"/>
+        <w:spacing w:after="220"/>
       </w:pPr>
     </w:p>
     <w:p>
@@ -1372,7 +1643,7 @@
           <w:sz w:val="26"/>
           <w:szCs w:val="26"/>
         </w:rPr>
-        <w:t xml:space="preserve">Defining the measures</w:t>
+        <w:t xml:space="preserve">NTMs act like a tax even when their aim is health or climate</w:t>
       </w:r>
     </w:p>
     <w:p>
@@ -1421,7 +1692,7 @@
           <w:sz w:val="26"/>
           <w:szCs w:val="26"/>
         </w:rPr>
-        <w:t xml:space="preserve">Measuring the reach</w:t>
+        <w:t xml:space="preserve">The EU applies NTMs to almost everything it imports</w:t>
       </w:r>
     </w:p>
     <w:p>
@@ -1433,7 +1704,7 @@
           <w:sz w:val="20"/>
           <w:szCs w:val="20"/>
         </w:rPr>
-        <w:t xml:space="preserve">The EU is among the economies that apply NTMs most intensively. Two indicators show this. The </w:t>
+        <w:t xml:space="preserve">Two indicators show how intensively an economy uses NTMs. The </w:t>
       </w:r>
       <w:r>
         <w:rPr>
@@ -1489,7 +1760,7 @@
           <w:sz w:val="15"/>
           <w:szCs w:val="15"/>
         </w:rPr>
-        <w:t xml:space="preserve">EXHIBIT 1</w:t>
+        <w:t xml:space="preserve">EXHIBIT 2</w:t>
       </w:r>
     </w:p>
     <w:p>
@@ -1536,7 +1807,13 @@
                     </pic:cNvPicPr>
                   </pic:nvPicPr>
                   <pic:blipFill>
-                    <a:blip r:embed="rId17" cstate="none"/>
+                    <a:blip r:embed="rId20" cstate="none">
+                      <a:extLst>
+                        <a:ext uri="{96DAC541-7B7A-43D3-8B79-37D633B846F1}">
+                          <asvg:svgBlip xmlns:asvg="http://schemas.microsoft.com/office/drawing/2016/SVG/main" r:embed="rId19"/>
+                        </a:ext>
+                      </a:extLst>
+                    </a:blip>
                     <a:srcRect/>
                     <a:stretch>
                       <a:fillRect/>
@@ -1601,7 +1878,7 @@
           <w:sz w:val="14"/>
           <w:szCs w:val="14"/>
         </w:rPr>
-        <w:t xml:space="preserve">Vietnam Customs and NSO (2025); UNCTAD as compiled by Krungsri Research (2026); ABrighter Research</w:t>
+        <w:t xml:space="preserve">Vietnam Customs and NSO (2025); UNCTAD (latest year by country); ABrighter Research</w:t>
       </w:r>
     </w:p>
     <w:p>
@@ -1642,7 +1919,7 @@
           <w:sz w:val="26"/>
           <w:szCs w:val="26"/>
         </w:rPr>
-        <w:t xml:space="preserve">Breadth as the EU's hallmark</w:t>
+        <w:t xml:space="preserve">Three EU measures matter most for Vietnam</w:t>
       </w:r>
     </w:p>
     <w:p>
@@ -1654,7 +1931,7 @@
           <w:sz w:val="20"/>
           <w:szCs w:val="20"/>
         </w:rPr>
-        <w:t xml:space="preserve">Although the two indicators look similar across the three economies, the EU uses NTMs differently in practice. It enforces them across virtually all product categories, whereas the United States and China impose stringent requirements on specific products. The EU also keeps adding new requirements that raise standards across whole product groups. The most important for Vietnam fall in two families.</w:t>
+        <w:t xml:space="preserve">Although the two indicators look similar across the three economies, the EU uses NTMs differently in practice. It enforces them across virtually all product categories, whereas the United States and China impose stringent requirements on specific products. The EU also keeps adding requirements that raise standards across whole product groups. The most important for Vietnam fall in two families: technical rules on carbon and land use and sanitary rules on food.</w:t>
       </w:r>
     </w:p>
     <w:p>
@@ -2627,26 +2904,40 @@
             </w:tcBorders>
             <w:shd w:fill="EEF3FF" w:color="auto" w:val="clear"/>
             <w:tcMar>
-              <w:top w:type="dxa" w:w="220"/>
-              <w:left w:type="dxa" w:w="260"/>
-              <w:bottom w:type="dxa" w:w="160"/>
-              <w:right w:type="dxa" w:w="260"/>
-            </w:tcMar>
-          </w:tcPr>
-          <w:p>
-            <w:pPr>
-              <w:spacing w:after="100"/>
+              <w:top w:type="dxa" w:w="240"/>
+              <w:left w:type="dxa" w:w="280"/>
+              <w:bottom w:type="dxa" w:w="180"/>
+              <w:right w:type="dxa" w:w="280"/>
+            </w:tcMar>
+          </w:tcPr>
+          <w:p>
+            <w:pPr>
+              <w:spacing w:after="80"/>
             </w:pPr>
             <w:r>
               <w:rPr>
                 <w:b/>
                 <w:bCs/>
                 <w:color w:val="2251FF"/>
-                <w:spacing w:val="30"/>
-                <w:sz w:val="16"/>
-                <w:szCs w:val="16"/>
-              </w:rPr>
-              <w:t xml:space="preserve">AT A GLANCE</w:t>
+                <w:spacing w:val="40"/>
+                <w:sz w:val="15"/>
+                <w:szCs w:val="15"/>
+              </w:rPr>
+              <w:t xml:space="preserve">KEY MESSAGE</w:t>
+            </w:r>
+          </w:p>
+          <w:p>
+            <w:pPr>
+              <w:spacing w:after="140" w:line="290"/>
+            </w:pPr>
+            <w:r>
+              <w:rPr>
+                <w:rFonts w:ascii="Georgia" w:cs="Georgia" w:eastAsia="Georgia" w:hAnsi="Georgia"/>
+                <w:color w:val="051C2C"/>
+                <w:sz w:val="25"/>
+                <w:szCs w:val="25"/>
+              </w:rPr>
+              <w:t xml:space="preserve">Vietnam is the ASEAN economy most exposed to EU NTMs on every broad measure and the exposure is growing with its exports.</w:t>
             </w:r>
           </w:p>
           <w:p>
@@ -2656,7 +2947,7 @@
                 <w:ilvl w:val="0"/>
                 <w:numId w:val="2"/>
               </w:numPr>
-              <w:spacing w:after="80" w:line="270"/>
+              <w:spacing w:after="70" w:line="264"/>
             </w:pPr>
             <w:r>
               <w:rPr>
@@ -2664,7 +2955,7 @@
                 <w:sz w:val="18"/>
                 <w:szCs w:val="18"/>
               </w:rPr>
-              <w:t xml:space="preserve">EU NTMs reach Vietnam directly through exports and investment and indirectly through imported inputs.</w:t>
+              <w:t xml:space="preserve">Its largest exports sit in product groups where NTMs raise prices most.</w:t>
             </w:r>
           </w:p>
           <w:p>
@@ -2674,7 +2965,7 @@
                 <w:ilvl w:val="0"/>
                 <w:numId w:val="2"/>
               </w:numPr>
-              <w:spacing w:after="80" w:line="270"/>
+              <w:spacing w:after="70" w:line="264"/>
             </w:pPr>
             <w:r>
               <w:rPr>
@@ -2682,7 +2973,7 @@
                 <w:sz w:val="18"/>
                 <w:szCs w:val="18"/>
               </w:rPr>
-              <w:t xml:space="preserve">Vietnam's largest exports sit in high-AVE product groups. Its NTM-sensitive exports to the EU equal 8.8% of GDP, more than twice any peer.</w:t>
+              <w:t xml:space="preserve">Its NTM-sensitive exports to the EU equal 8.8% of GDP, more than twice any peer.</w:t>
             </w:r>
           </w:p>
           <w:p>
@@ -2692,7 +2983,7 @@
                 <w:ilvl w:val="0"/>
                 <w:numId w:val="2"/>
               </w:numPr>
-              <w:spacing w:after="80" w:line="270"/>
+              <w:spacing w:after="70" w:line="264"/>
             </w:pPr>
             <w:r>
               <w:rPr>
@@ -2700,25 +2991,7 @@
                 <w:sz w:val="18"/>
                 <w:szCs w:val="18"/>
               </w:rPr>
-              <w:t xml:space="preserve">Vietnam is the ASEAN economy most dependent on metal exports to the EU (18.8%). Its CBAM adjustment cost is moderate today but rises with every year of phase-in.</w:t>
-            </w:r>
-          </w:p>
-          <w:p>
-            <w:pPr>
-              <w:pStyle w:val="ListParagraph"/>
-              <w:numPr>
-                <w:ilvl w:val="0"/>
-                <w:numId w:val="2"/>
-              </w:numPr>
-              <w:spacing w:after="80" w:line="270"/>
-            </w:pPr>
-            <w:r>
-              <w:rPr>
-                <w:color w:val="051C2C"/>
-                <w:sz w:val="18"/>
-                <w:szCs w:val="18"/>
-              </w:rPr>
-              <w:t xml:space="preserve">EUDR exposure runs mainly through coffee (3.9% of exports to the EU), followed by wood and rubber.</w:t>
+              <w:t xml:space="preserve">Steel makes it the region's most CBAM-dependent exporter while coffee brings it inside the EUDR.</w:t>
             </w:r>
           </w:p>
         </w:tc>
@@ -2726,7 +2999,7 @@
     </w:tbl>
     <w:p>
       <w:pPr>
-        <w:spacing w:after="200"/>
+        <w:spacing w:after="220"/>
       </w:pPr>
     </w:p>
     <w:p>
@@ -2742,7 +3015,7 @@
           <w:sz w:val="26"/>
           <w:szCs w:val="26"/>
         </w:rPr>
-        <w:t xml:space="preserve">1. Tracing the transmission</w:t>
+        <w:t xml:space="preserve">1. EU rules reach Vietnam through three channels</w:t>
       </w:r>
     </w:p>
     <w:p>
@@ -2798,7 +3071,7 @@
           <w:sz w:val="20"/>
           <w:szCs w:val="20"/>
         </w:rPr>
-        <w:t xml:space="preserve"> through the raw materials and intermediate goods it imports from partners that are themselves affected by NTMs (Exhibit 2).</w:t>
+        <w:t xml:space="preserve"> through the raw materials and intermediate goods it imports from partners that are themselves affected by NTMs (Exhibit 3).</w:t>
       </w:r>
     </w:p>
     <w:p>
@@ -2816,7 +3089,7 @@
           <w:sz w:val="15"/>
           <w:szCs w:val="15"/>
         </w:rPr>
-        <w:t xml:space="preserve">EXHIBIT 2</w:t>
+        <w:t xml:space="preserve">EXHIBIT 3</w:t>
       </w:r>
     </w:p>
     <w:p>
@@ -2847,7 +3120,7 @@
       <w:r>
         <w:drawing>
           <wp:inline distT="0" distB="0" distL="0" distR="0">
-            <wp:extent cx="6115050" cy="3590925"/>
+            <wp:extent cx="6115050" cy="3600450"/>
             <wp:effectExtent t="0" r="0" b="0" l="0"/>
             <wp:docPr id="1" name="" descr="" title=""/>
             <wp:cNvGraphicFramePr>
@@ -2863,7 +3136,13 @@
                     </pic:cNvPicPr>
                   </pic:nvPicPr>
                   <pic:blipFill>
-                    <a:blip r:embed="rId18" cstate="none"/>
+                    <a:blip r:embed="rId22" cstate="none">
+                      <a:extLst>
+                        <a:ext uri="{96DAC541-7B7A-43D3-8B79-37D633B846F1}">
+                          <asvg:svgBlip xmlns:asvg="http://schemas.microsoft.com/office/drawing/2016/SVG/main" r:embed="rId21"/>
+                        </a:ext>
+                      </a:extLst>
+                    </a:blip>
                     <a:srcRect/>
                     <a:stretch>
                       <a:fillRect/>
@@ -2872,7 +3151,7 @@
                   <pic:spPr bwMode="auto">
                     <a:xfrm>
                       <a:off x="0" y="0"/>
-                      <a:ext cx="6115050" cy="3590925"/>
+                      <a:ext cx="6115050" cy="3600450"/>
                     </a:xfrm>
                     <a:prstGeom prst="rect">
                       <a:avLst/>
@@ -2905,7 +3184,7 @@
           <w:sz w:val="14"/>
           <w:szCs w:val="14"/>
         </w:rPr>
-        <w:t xml:space="preserve">Adapted from Krungsri Research (2026), Figure 2, with Vietnamese data for 2025 and H1 2026. Melt and pour refers to the EU steel rule that assigns origin to the country where the steel was first melted.</w:t>
+        <w:t xml:space="preserve">Melt and pour refers to the EU steel rule that assigns origin to the country where the steel was first melted.</w:t>
       </w:r>
     </w:p>
     <w:p>
@@ -2928,29 +3207,19 @@
           <w:sz w:val="14"/>
           <w:szCs w:val="14"/>
         </w:rPr>
-        <w:t xml:space="preserve">Krungsri Research (2026) framework adapted for Vietnam by ABrighter Research</w:t>
+        <w:t xml:space="preserve">ABrighter Research using NSO and MOIT data (2025, H1 2026)</w:t>
       </w:r>
     </w:p>
     <w:p>
       <w:pPr>
         <w:spacing w:after="140" w:line="288"/>
       </w:pPr>
-      <w:r>
-        <w:rPr>
-          <w:b/>
-          <w:bCs/>
-          <w:color w:val="2251FF"/>
-          <w:sz w:val="15"/>
-          <w:szCs w:val="15"/>
-        </w:rPr>
-        <w:t xml:space="preserve">[Inference]</w:t>
-      </w:r>
       <w:r>
         <w:rPr>
           <w:sz w:val="20"/>
           <w:szCs w:val="20"/>
         </w:rPr>
-        <w:t xml:space="preserve"> The indirect channel matters more for Vietnam than for most peers. Much of what Vietnam exports is assembled or finished from imported materials: in the first half of 2026 alone it imported USD 115.2 billion of goods from China.</w:t>
+        <w:t xml:space="preserve">The indirect channel matters more for Vietnam than for most of its peers. Much of what Vietnam exports is assembled or finished from imported materials: in the first half of 2026 alone it imported USD 115.2 billion of goods from China.</w:t>
       </w:r>
       <w:r>
         <w:rPr>
@@ -2972,45 +3241,22 @@
       </w:pPr>
       <w:r>
         <w:rPr>
-          <w:b/>
-          <w:bCs/>
-          <w:color w:val="2251FF"/>
-          <w:sz w:val="15"/>
-          <w:szCs w:val="15"/>
-        </w:rPr>
-        <w:t xml:space="preserve">[Inference]</w:t>
-      </w:r>
-      <w:r>
-        <w:rPr>
           <w:sz w:val="20"/>
           <w:szCs w:val="20"/>
         </w:rPr>
-        <w:t xml:space="preserve"> The first half of 2026 suggests this channel is widening. Imports grew by 33.4% to USD 283.2 billion against export growth of 21%, turning a surplus into a deficit of USD 16.65 billion.</w:t>
-      </w:r>
-      <w:r>
-        <w:rPr>
-          <w:rStyle w:val="FootnoteReference"/>
-        </w:rPr>
-        <w:footnoteReference w:id="11"/>
-      </w:r>
+        <w:t xml:space="preserve">The first half of 2026 shows this channel widening. Imports grew by 33.4% to USD 283.2 billion against export growth of 21%, turning a surplus into a deficit of USD 16.65 billion. Most of the increase was machinery, equipment and materials for the factories that export. At the level of the economy this is a sign of investment. At the level of the firm it means more of each export carries an input whose carbon, origin and legality the EU may ask about.</w:t>
+      </w:r>
+    </w:p>
+    <w:p>
+      <w:pPr>
+        <w:spacing w:after="140" w:line="288"/>
+      </w:pPr>
       <w:r>
         <w:rPr>
           <w:sz w:val="20"/>
           <w:szCs w:val="20"/>
         </w:rPr>
-        <w:t xml:space="preserve"> Most of the increase was machinery, equipment and materials for the factories that export. At the level of the economy this is a sign of investment. At the level of the firm it means more of each export carries an input whose carbon, origin and legality the EU may ask about.</w:t>
-      </w:r>
-    </w:p>
-    <w:p>
-      <w:pPr>
-        <w:spacing w:after="140" w:line="288"/>
-      </w:pPr>
-      <w:r>
-        <w:rPr>
-          <w:sz w:val="20"/>
-          <w:szCs w:val="20"/>
-        </w:rPr>
-        <w:t xml:space="preserve">The size of the impact depends on three factors: dependence on exports to the EU, the share of imported raw materials and the flexibility of domestic supply chains. If Vietnam adapts more slowly than its competitors it risks losing export market share and long-term competitiveness. We assess the impact on three dimensions, following Krungsri Research. The first is the product-group impact measured by the ad valorem equivalent (AVE). The second is export exposure to the EU, both overall and by product group. The third is the impact of the two environmental measures, CBAM and the EUDR.</w:t>
+        <w:t xml:space="preserve">The size of the impact depends on three factors: dependence on exports to the EU, the share of imported raw materials and the flexibility of domestic supply chains. If Vietnam adapts more slowly than its competitors it risks losing market share and long-term competitiveness. We therefore assess the impact on three dimensions. The first is the product-group impact measured by the ad valorem equivalent (AVE). The second is export exposure to the EU, both overall and by product group. The third is the impact of the two environmental measures, CBAM and the EUDR.</w:t>
       </w:r>
     </w:p>
     <w:p>
@@ -3026,7 +3272,7 @@
           <w:sz w:val="26"/>
           <w:szCs w:val="26"/>
         </w:rPr>
-        <w:t xml:space="preserve">2. Weighing the products</w:t>
+        <w:t xml:space="preserve">2. Vietnam's export basket sits where NTMs bite hardest</w:t>
       </w:r>
     </w:p>
     <w:p>
@@ -3044,14 +3290,14 @@
         <w:rPr>
           <w:rStyle w:val="FootnoteReference"/>
         </w:rPr>
-        <w:footnoteReference w:id="12"/>
+        <w:footnoteReference w:id="11"/>
       </w:r>
       <w:r>
         <w:rPr>
           <w:sz w:val="20"/>
           <w:szCs w:val="20"/>
         </w:rPr>
-        <w:t xml:space="preserve"> For agricultural and food products the average AVE reaches about 20%. EU import prices for these goods are therefore around 20% higher than domestic prices because of NTMs. This reflects stricter measures such as quotas, price controls and SPS and TBT requirements. Among manufactures the highest AVEs, at around 8% to 10%, fall on machinery and electronics, motor vehicles and apparel.</w:t>
+        <w:t xml:space="preserve"> For agricultural and food products the average AVE reaches about 20%. EU import prices for these goods are therefore around 20% higher than domestic prices because of NTMs, reflecting quotas, price controls and SPS and TBT requirements. Among manufactures the highest AVEs, at around 8% to 10%, fall on machinery and electronics, motor vehicles and apparel.</w:t>
       </w:r>
     </w:p>
     <w:p>
@@ -3063,7 +3309,7 @@
           <w:sz w:val="20"/>
           <w:szCs w:val="20"/>
         </w:rPr>
-        <w:t xml:space="preserve">On this basis product groups fall into four tiers, from highest to lowest impact. Agricultural and food products sit in the 'Very High' tier. Apparel and textiles, motor vehicles, electronics and machinery form the 'High' tier. Chemicals, metals, rubber and plastics make up the 'Moderate' tier. Minerals, oil and gas sit in the 'Low' tier.</w:t>
+        <w:t xml:space="preserve">On this basis product groups fall into four tiers. Agricultural and food products sit in the 'Very High' tier. Apparel and textiles, motor vehicles, electronics and machinery form the 'High' tier. Chemicals, metals, rubber and plastics make up the 'Moderate' tier. Minerals, oil and gas sit in the 'Low' tier.</w:t>
       </w:r>
     </w:p>
     <w:p>
@@ -3081,7 +3327,7 @@
         <w:rPr>
           <w:rStyle w:val="FootnoteReference"/>
         </w:rPr>
-        <w:footnoteReference w:id="13"/>
+        <w:footnoteReference w:id="12"/>
       </w:r>
       <w:r>
         <w:rPr>
@@ -3106,7 +3352,7 @@
           <w:sz w:val="15"/>
           <w:szCs w:val="15"/>
         </w:rPr>
-        <w:t xml:space="preserve">EXHIBIT 3</w:t>
+        <w:t xml:space="preserve">EXHIBIT 4</w:t>
       </w:r>
     </w:p>
     <w:p>
@@ -3153,7 +3399,13 @@
                     </pic:cNvPicPr>
                   </pic:nvPicPr>
                   <pic:blipFill>
-                    <a:blip r:embed="rId19" cstate="none"/>
+                    <a:blip r:embed="rId24" cstate="none">
+                      <a:extLst>
+                        <a:ext uri="{96DAC541-7B7A-43D3-8B79-37D633B846F1}">
+                          <asvg:svgBlip xmlns:asvg="http://schemas.microsoft.com/office/drawing/2016/SVG/main" r:embed="rId23"/>
+                        </a:ext>
+                      </a:extLst>
+                    </a:blip>
                     <a:srcRect/>
                     <a:stretch>
                       <a:fillRect/>
@@ -3195,7 +3447,7 @@
           <w:sz w:val="14"/>
           <w:szCs w:val="14"/>
         </w:rPr>
-        <w:t xml:space="preserve">AVE proxies are simple averages by product group read from UNCTAD and World Bank (2018) as reproduced in Krungsri Research (2026, Figure 3) and mapped to Vietnam's export items by ABrighter Research. Implied cost wedge = 2025 export value x AVE proxy. It indicates scale only and is not an estimate of the cost borne by Vietnamese firms.</w:t>
+        <w:t xml:space="preserve">AVE proxies are simple averages by product group from UNCTAD and World Bank (2018), mapped to Vietnam's export items by ABrighter Research. Implied cost wedge = 2025 export value x AVE proxy. It indicates scale only and is not an estimate of the cost borne by Vietnamese firms.</w:t>
       </w:r>
     </w:p>
     <w:p>
@@ -3218,95 +3470,55 @@
           <w:sz w:val="14"/>
           <w:szCs w:val="14"/>
         </w:rPr>
-        <w:t xml:space="preserve">NSO and Customs (2025); UNCTAD and World Bank (2018); Krungsri Research (2026); ABrighter Research</w:t>
+        <w:t xml:space="preserve">NSO and Customs (2025); UNCTAD and World Bank (2018); ABrighter Research</w:t>
       </w:r>
     </w:p>
     <w:p>
       <w:pPr>
         <w:spacing w:after="140" w:line="288"/>
       </w:pPr>
-      <w:r>
-        <w:rPr>
-          <w:b/>
-          <w:bCs/>
-          <w:color w:val="2251FF"/>
-          <w:sz w:val="15"/>
-          <w:szCs w:val="15"/>
-        </w:rPr>
-        <w:t xml:space="preserve">[Inference]</w:t>
-      </w:r>
       <w:r>
         <w:rPr>
           <w:sz w:val="20"/>
           <w:szCs w:val="20"/>
         </w:rPr>
-        <w:t xml:space="preserve"> Multiplying each item by its AVE gives an implied cost wedge of about USD 23.3 billion, a weighted AVE of 7.0%. The figure needs careful reading. The AVE measures a price gap that importers, exporters and consumers share between them. It shows where NTMs bite and not who bears the bite.</w:t>
+        <w:t xml:space="preserve">Multiplying each item by its AVE gives an implied cost wedge of about USD 23.3 billion, a weighted AVE of 7.0%. The figure should be read as a measure of where NTMs bite and not of who bears the bite. The AVE is a price gap that importers, exporters and consumers share between them.</w:t>
       </w:r>
     </w:p>
     <w:p>
       <w:pPr>
         <w:spacing w:after="140" w:line="288"/>
       </w:pPr>
-      <w:r>
-        <w:rPr>
-          <w:b/>
-          <w:bCs/>
-          <w:color w:val="2251FF"/>
-          <w:sz w:val="15"/>
-          <w:szCs w:val="15"/>
-        </w:rPr>
-        <w:t xml:space="preserve">[Inference]</w:t>
-      </w:r>
       <w:r>
         <w:rPr>
           <w:sz w:val="20"/>
           <w:szCs w:val="20"/>
         </w:rPr>
-        <w:t xml:space="preserve"> Two features stand out. The bright spot is electronics, the largest item at USD 107.8 billion, with one of the lower AVEs in its tier at around 3.9%. Its compliance work is concentrated in large foreign-invested firms that already meet global standards. One must not overlook seafood and coffee, which carry AVEs of 27.3% and 20.8%. These sectors rely on large numbers of smallholders and small processors. The burden per dollar exported is highest exactly where the capacity to comply is lowest.</w:t>
+        <w:t xml:space="preserve">Two features stand out in the ledger. The bright spot is electronics, the largest item at USD 107.8 billion, with one of the lower AVEs in its tier at around 3.9%. Its compliance work is concentrated in large foreign-invested firms that already meet global standards. One must not overlook seafood and coffee, which carry AVEs of 27.3% and 20.8%. These sectors rely on large numbers of smallholders and small processors. The burden per dollar exported is highest exactly where the capacity to comply is lowest.</w:t>
       </w:r>
     </w:p>
     <w:p>
       <w:pPr>
         <w:spacing w:after="140" w:line="288"/>
       </w:pPr>
-      <w:r>
-        <w:rPr>
-          <w:b/>
-          <w:bCs/>
-          <w:color w:val="2251FF"/>
-          <w:sz w:val="15"/>
-          <w:szCs w:val="15"/>
-        </w:rPr>
-        <w:t xml:space="preserve">[Inference]</w:t>
-      </w:r>
       <w:r>
         <w:rPr>
           <w:sz w:val="20"/>
           <w:szCs w:val="20"/>
         </w:rPr>
-        <w:t xml:space="preserve"> Who pays the wedge depends on bargaining power. A multinational assembler that sells a phone to a European distributor can pass much of the cost on or spread it across many markets. A coffee farmer cannot. Farmers sell to collectors at a price set by the world market, so any extra cost of testing or traceability tends to come back to them as a lower farm-gate price. Without public support for shared testing and traceability, the cost of EU rules would most likely fall on the poorest link in the chain. That is why the response to NTMs is a question of rural incomes and not only of trade.</w:t>
+        <w:t xml:space="preserve">Who pays the wedge depends on bargaining power. A multinational assembler that sells a phone to a European distributor can pass much of the cost on or spread it across many markets. A coffee farmer cannot. Farmers sell to collectors at a price set by the world market, so any extra cost of testing or traceability tends to come back to them as a lower farm-gate price. Without shared public support for testing and traceability, the cost of EU rules would most likely fall on the poorest link in the chain. The response to NTMs is therefore a question of rural incomes as well as of trade.</w:t>
       </w:r>
     </w:p>
     <w:p>
       <w:pPr>
         <w:spacing w:after="140" w:line="288"/>
       </w:pPr>
-      <w:r>
-        <w:rPr>
-          <w:b/>
-          <w:bCs/>
-          <w:color w:val="2251FF"/>
-          <w:sz w:val="15"/>
-          <w:szCs w:val="15"/>
-        </w:rPr>
-        <w:t xml:space="preserve">[Inference]</w:t>
-      </w:r>
       <w:r>
         <w:rPr>
           <w:sz w:val="20"/>
           <w:szCs w:val="20"/>
         </w:rPr>
-        <w:t xml:space="preserve"> A second shift is under way. Vietnam is trying to raise the domestic content of its electronics exports by bringing local suppliers into the chains of foreign investors. As it succeeds, compliance work that multinationals now absorb will pass to Vietnamese small and medium firms. Higher local content is the right goal. It will also widen the circle of firms that must meet EU standards on their own.</w:t>
+        <w:t xml:space="preserve">A second shift is under way. Vietnam is working to raise the domestic content of its electronics exports by bringing local suppliers into the chains of foreign investors. As that succeeds, compliance work that multinationals now absorb will pass to Vietnamese small and medium firms. Higher local content is the right goal. It will also widen the circle of firms that must meet EU standards on their own.</w:t>
       </w:r>
     </w:p>
     <w:p>
@@ -3322,7 +3534,7 @@
           <w:sz w:val="26"/>
           <w:szCs w:val="26"/>
         </w:rPr>
-        <w:t xml:space="preserve">3. Measuring dependence on Europe</w:t>
+        <w:t xml:space="preserve">3. No ASEAN peer depends on Europe as much as Vietnam</w:t>
       </w:r>
     </w:p>
     <w:p>
@@ -3340,14 +3552,14 @@
         <w:rPr>
           <w:rStyle w:val="FootnoteReference"/>
         </w:rPr>
-        <w:footnoteReference w:id="14"/>
+        <w:footnoteReference w:id="13"/>
       </w:r>
       <w:r>
         <w:rPr>
           <w:sz w:val="20"/>
           <w:szCs w:val="20"/>
         </w:rPr>
-        <w:t xml:space="preserve"> The Philippines sends a similar share (11.0%) but that is only 1.7% of its GDP. Measured against the size of the economy, Thailand (4.6% of GDP) and Malaysia (6.0%) are more exposed than the Philippines and Indonesia. Vietnam's exposure is nonetheless almost twice Malaysia's.</w:t>
+        <w:t xml:space="preserve"> The Philippines sends a similar share (11.0%) but that is only 1.7% of its GDP. Thailand (4.6% of GDP) and Malaysia (6.0%) are more exposed than the Philippines and Indonesia relative to the size of their economies. Vietnam's exposure is nonetheless almost twice Malaysia's.</w:t>
       </w:r>
     </w:p>
     <w:p>
@@ -3365,7 +3577,7 @@
         <w:rPr>
           <w:rStyle w:val="FootnoteReference"/>
         </w:rPr>
-        <w:footnoteReference w:id="15"/>
+        <w:footnoteReference w:id="14"/>
       </w:r>
       <w:r>
         <w:rPr>
@@ -3378,42 +3590,32 @@
         <w:rPr>
           <w:rStyle w:val="FootnoteReference"/>
         </w:rPr>
-        <w:footnoteReference w:id="16"/>
+        <w:footnoteReference w:id="15"/>
       </w:r>
       <w:r>
         <w:rPr>
           <w:sz w:val="20"/>
           <w:szCs w:val="20"/>
         </w:rPr>
-        <w:t xml:space="preserve"> Vietnam's EU exposure has therefore kept pace with an economy that grew by 8.02% in 2025.</w:t>
+        <w:t xml:space="preserve"> Vietnam's exposure to Europe has kept pace with an economy that grew by 8.02% in 2025.</w:t>
       </w:r>
       <w:r>
         <w:rPr>
           <w:rStyle w:val="FootnoteReference"/>
         </w:rPr>
-        <w:footnoteReference w:id="17"/>
+        <w:footnoteReference w:id="16"/>
       </w:r>
     </w:p>
     <w:p>
       <w:pPr>
         <w:spacing w:after="140" w:line="288"/>
       </w:pPr>
-      <w:r>
-        <w:rPr>
-          <w:b/>
-          <w:bCs/>
-          <w:color w:val="2251FF"/>
-          <w:sz w:val="15"/>
-          <w:szCs w:val="15"/>
-        </w:rPr>
-        <w:t xml:space="preserve">[Inference]</w:t>
-      </w:r>
       <w:r>
         <w:rPr>
           <w:sz w:val="20"/>
           <w:szCs w:val="20"/>
         </w:rPr>
-        <w:t xml:space="preserve"> The record surplus deserves a second reading. For trade policy it shows the success of the EVFTA. For NTM risk it measures how much Vietnam has to lose. A country that sells USD 3 to the EU for every USD 1 it buys from it has little to offer in return when it asks for flexibility on a rule. Its leverage lies instead in being a reliable and compliant supplier, which is exactly what the new measures test.</w:t>
+        <w:t xml:space="preserve">The record surplus deserves a second reading. For trade policy it shows the success of the EVFTA. For NTM risk it measures how much Vietnam has to lose. A country that sells USD 3 to the EU for every USD 1 it buys has little to offer in return when it asks for flexibility on a rule. Its leverage lies instead in being a reliable and compliant supplier, which is exactly what the new measures test.</w:t>
       </w:r>
     </w:p>
     <w:p>
@@ -3431,7 +3633,7 @@
           <w:sz w:val="15"/>
           <w:szCs w:val="15"/>
         </w:rPr>
-        <w:t xml:space="preserve">EXHIBIT 4</w:t>
+        <w:t xml:space="preserve">EXHIBIT 5</w:t>
       </w:r>
     </w:p>
     <w:p>
@@ -3478,7 +3680,13 @@
                     </pic:cNvPicPr>
                   </pic:nvPicPr>
                   <pic:blipFill>
-                    <a:blip r:embed="rId20" cstate="none"/>
+                    <a:blip r:embed="rId26" cstate="none">
+                      <a:extLst>
+                        <a:ext uri="{96DAC541-7B7A-43D3-8B79-37D633B846F1}">
+                          <asvg:svgBlip xmlns:asvg="http://schemas.microsoft.com/office/drawing/2016/SVG/main" r:embed="rId25"/>
+                        </a:ext>
+                      </a:extLst>
+                    </a:blip>
                     <a:srcRect/>
                     <a:stretch>
                       <a:fillRect/>
@@ -3543,7 +3751,7 @@
           <w:sz w:val="14"/>
           <w:szCs w:val="14"/>
         </w:rPr>
-        <w:t xml:space="preserve">Krungsri Research (2026) using CEIC and Trade Map (2024); MOIT and NSO (2025); ABrighter Research</w:t>
+        <w:t xml:space="preserve">CEIC and Trade Map (2024) as compiled by Krungsri Research (2026); MOIT and NSO (2025); ABrighter Research</w:t>
       </w:r>
     </w:p>
     <w:p>
@@ -3555,42 +3763,25 @@
           <w:sz w:val="20"/>
           <w:szCs w:val="20"/>
         </w:rPr>
-        <w:t xml:space="preserve">Combining export dependence with product structure sharpens the result. Vietnam's NTM-sensitive exports to the EU amount to 8.8% of GDP and 22.1% of its exports of the same products to the world. Malaysia and Thailand follow at 3.8% and 3.3% of GDP. The Philippines and Indonesia are much less affected. </w:t>
-      </w:r>
-      <w:r>
-        <w:rPr>
-          <w:b/>
-          <w:bCs/>
-          <w:color w:val="2251FF"/>
-          <w:sz w:val="15"/>
-          <w:szCs w:val="15"/>
-        </w:rPr>
-        <w:t xml:space="preserve">[Inference]</w:t>
-      </w:r>
+        <w:t xml:space="preserve">Combining dependence with product structure sharpens the result. Vietnam's NTM-sensitive exports to the EU amount to 8.8% of GDP and 22.1% of its exports of the same products to the world. Malaysia and Thailand follow at 3.8% and 3.3% of GDP. The Philippines and Indonesia are much less affected. Vietnam faces the highest risk in the region because it combines the highest dependence on the EU with a basket concentrated in sensitive products.</w:t>
+      </w:r>
+    </w:p>
+    <w:p>
+      <w:pPr>
+        <w:spacing w:after="140" w:line="288"/>
+      </w:pPr>
       <w:r>
         <w:rPr>
           <w:sz w:val="20"/>
           <w:szCs w:val="20"/>
         </w:rPr>
-        <w:t xml:space="preserve"> Vietnam faces the highest risk of impact in the region because it combines the highest dependence on the EU with a basket concentrated in sensitive products.</w:t>
-      </w:r>
-    </w:p>
-    <w:p>
-      <w:pPr>
-        <w:spacing w:after="140" w:line="288"/>
-      </w:pPr>
-      <w:r>
-        <w:rPr>
-          <w:sz w:val="20"/>
-          <w:szCs w:val="20"/>
-        </w:rPr>
         <w:t xml:space="preserve">What Vietnam sends to the EU matters as much as how much. In 2024 81.4% of Vietnam's exports to the EU fell in NTM-sensitive product groups. Electronics and machinery made up 46.5%, other 'High' tier manufactures such as garments, footwear and furniture 24.6% and agri-food 10.2%. Only the Philippines, at 88.4%, had a higher share. National data for 2025 support this structure. Computers and electronics (USD 10.89 billion), machinery (USD 7.42 billion) and phones (USD 6.90 billion) together made up 44.9% of exports to the EU.</w:t>
       </w:r>
       <w:r>
         <w:rPr>
           <w:rStyle w:val="FootnoteReference"/>
         </w:rPr>
-        <w:footnoteReference w:id="18"/>
+        <w:footnoteReference w:id="17"/>
       </w:r>
     </w:p>
     <w:p>
@@ -3608,7 +3799,7 @@
           <w:sz w:val="15"/>
           <w:szCs w:val="15"/>
         </w:rPr>
-        <w:t xml:space="preserve">EXHIBIT 5</w:t>
+        <w:t xml:space="preserve">EXHIBIT 6</w:t>
       </w:r>
     </w:p>
     <w:p>
@@ -3655,7 +3846,13 @@
                     </pic:cNvPicPr>
                   </pic:nvPicPr>
                   <pic:blipFill>
-                    <a:blip r:embed="rId21" cstate="none"/>
+                    <a:blip r:embed="rId28" cstate="none">
+                      <a:extLst>
+                        <a:ext uri="{96DAC541-7B7A-43D3-8B79-37D633B846F1}">
+                          <asvg:svgBlip xmlns:asvg="http://schemas.microsoft.com/office/drawing/2016/SVG/main" r:embed="rId27"/>
+                        </a:ext>
+                      </a:extLst>
+                    </a:blip>
                     <a:srcRect/>
                     <a:stretch>
                       <a:fillRect/>
@@ -3720,29 +3917,19 @@
           <w:sz w:val="14"/>
           <w:szCs w:val="14"/>
         </w:rPr>
-        <w:t xml:space="preserve">Krungsri Research (2026) using Trade Map (2024); MOIT and NSO (2025); ABrighter Research</w:t>
+        <w:t xml:space="preserve">Trade Map (2024) as compiled by Krungsri Research (2026); MOIT and NSO (2025); ABrighter Research</w:t>
       </w:r>
     </w:p>
     <w:p>
       <w:pPr>
         <w:spacing w:after="140" w:line="288"/>
       </w:pPr>
-      <w:r>
-        <w:rPr>
-          <w:b/>
-          <w:bCs/>
-          <w:color w:val="2251FF"/>
-          <w:sz w:val="15"/>
-          <w:szCs w:val="15"/>
-        </w:rPr>
-        <w:t xml:space="preserve">[Inference]</w:t>
-      </w:r>
       <w:r>
         <w:rPr>
           <w:sz w:val="20"/>
           <w:szCs w:val="20"/>
         </w:rPr>
-        <w:t xml:space="preserve"> Applied to 2025 values this structure puts USD 45.7 billion of exports in NTM-sensitive groups, or 8.9% of GDP. The figure is close to the 8.8% for 2024. As in most ASEAN economies, electronics and machinery account for around half of the total, so the impact of NTMs on Vietnam is likely to be concentrated in that product group. Garments, footwear and furniture then add a further quarter. For these products the next wave of EU rules on product passports and supply-chain due diligence will matter more than tariffs.</w:t>
+        <w:t xml:space="preserve">Applied to 2025 values, this structure places about USD 45.7 billion of exports in NTM-sensitive groups, or 8.9% of GDP on our calculation. The figure is close to the 8.8% for 2024, which confirms that exposure has grown in step with the economy. As in most ASEAN economies electronics and machinery account for around half of the total, so the impact on Vietnam is likely to be concentrated in that group. Garments, footwear and furniture add a further quarter. For these products the next wave of EU rules on product passports and supply-chain due diligence will matter more than tariffs.</w:t>
       </w:r>
     </w:p>
     <w:p>
@@ -3758,7 +3945,7 @@
           <w:sz w:val="26"/>
           <w:szCs w:val="26"/>
         </w:rPr>
-        <w:t xml:space="preserve">4. Pricing carbon at the border</w:t>
+        <w:t xml:space="preserve">4. Steel makes Vietnam the region's front line for CBAM</w:t>
       </w:r>
     </w:p>
     <w:p>
@@ -3770,7 +3957,7 @@
           <w:sz w:val="20"/>
           <w:szCs w:val="20"/>
         </w:rPr>
-        <w:t xml:space="preserve">The EU imposes strict environmental standards on imported goods and these reach Vietnam's main exports and supply chains. We assess the two most important measures in turn.</w:t>
+        <w:t xml:space="preserve">The EU imposes strict environmental standards on imported goods and these reach Vietnam's main exports and supply chains. We assess the two most important measures in turn, starting with carbon.</w:t>
       </w:r>
     </w:p>
     <w:p>
@@ -3786,7 +3973,7 @@
           <w:sz w:val="20"/>
           <w:szCs w:val="20"/>
         </w:rPr>
-        <w:t xml:space="preserve">CBAM: the rules from 2026</w:t>
+        <w:t xml:space="preserve">The rules reward data and penalise its absence</w:t>
       </w:r>
     </w:p>
     <w:p>
@@ -3810,13 +3997,13 @@
           <w:sz w:val="20"/>
           <w:szCs w:val="20"/>
         </w:rPr>
-        <w:t xml:space="preserve">The rules for the definitive period were adjusted before it began. The CBAM Omnibus, in force since 20 October 2025, exempts importers that bring in less than 50 tonnes a year of covered goods. It also delays the sale of certificates until February 2027.</w:t>
+        <w:t xml:space="preserve">The rules for the definitive period were adjusted before it began. The CBAM Omnibus, in force since 20 October 2025, exempts importers that bring in less than 50 tonnes a year of covered goods and delays the sale of certificates until February 2027.</w:t>
       </w:r>
       <w:r>
         <w:rPr>
           <w:rStyle w:val="FootnoteReference"/>
         </w:rPr>
-        <w:footnoteReference w:id="19"/>
+        <w:footnoteReference w:id="18"/>
       </w:r>
       <w:r>
         <w:rPr>
@@ -3829,7 +4016,7 @@
         <w:rPr>
           <w:rStyle w:val="FootnoteReference"/>
         </w:rPr>
-        <w:footnoteReference w:id="20"/>
+        <w:footnoteReference w:id="19"/>
       </w:r>
       <w:r>
         <w:rPr>
@@ -3842,14 +4029,7 @@
         <w:rPr>
           <w:rStyle w:val="FootnoteReference"/>
         </w:rPr>
-        <w:footnoteReference w:id="21"/>
-      </w:r>
-      <w:r>
-        <w:rPr>
-          <w:sz w:val="20"/>
-          <w:szCs w:val="20"/>
-        </w:rPr>
-        <w:t xml:space="preserve"> The design rewards data and penalises its absence.</w:t>
+        <w:footnoteReference w:id="20"/>
       </w:r>
     </w:p>
     <w:p>
@@ -3865,7 +4045,7 @@
           <w:sz w:val="20"/>
           <w:szCs w:val="20"/>
         </w:rPr>
-        <w:t xml:space="preserve">CBAM: why Vietnam is exposed</w:t>
+        <w:t xml:space="preserve">Dependence is high while adjustment cost is still moderate</w:t>
       </w:r>
     </w:p>
     <w:p>
@@ -3883,7 +4063,7 @@
         <w:rPr>
           <w:rStyle w:val="FootnoteReference"/>
         </w:rPr>
-        <w:footnoteReference w:id="22"/>
+        <w:footnoteReference w:id="21"/>
       </w:r>
       <w:r>
         <w:rPr>
@@ -3902,7 +4082,7 @@
           <w:sz w:val="20"/>
           <w:szCs w:val="20"/>
         </w:rPr>
-        <w:t xml:space="preserve">CBAM also raises adjustment costs. Firms must change production to cut emissions and may have to replace imported steel or metal inputs with greener and more expensive ones. Krungsri Research captured this with the CBAM aggregate trade exposure index. The index measures the extra carbon cost, or excess carbon payment, relative to the export value of CBAM-covered products. Indonesia scores highest at 0.0075 because its metal industry spans the whole chain, including carbon-intensive smelting. Vietnam scores 0.0007.</w:t>
+        <w:t xml:space="preserve">CBAM also raises adjustment costs. Firms must change production to cut emissions and may have to replace imported steel or metal inputs with greener and more expensive ones. The CBAM aggregate trade exposure index captures this by measuring the extra carbon cost relative to the export value of CBAM-covered products. Indonesia scores highest at 0.0075 because its metal industry spans the whole chain, including carbon-intensive smelting. Vietnam scores 0.0007.</w:t>
       </w:r>
     </w:p>
     <w:p>
@@ -3920,7 +4100,7 @@
           <w:sz w:val="15"/>
           <w:szCs w:val="15"/>
         </w:rPr>
-        <w:t xml:space="preserve">EXHIBIT 6</w:t>
+        <w:t xml:space="preserve">EXHIBIT 7</w:t>
       </w:r>
     </w:p>
     <w:p>
@@ -3967,7 +4147,13 @@
                     </pic:cNvPicPr>
                   </pic:nvPicPr>
                   <pic:blipFill>
-                    <a:blip r:embed="rId22" cstate="none"/>
+                    <a:blip r:embed="rId30" cstate="none">
+                      <a:extLst>
+                        <a:ext uri="{96DAC541-7B7A-43D3-8B79-37D633B846F1}">
+                          <asvg:svgBlip xmlns:asvg="http://schemas.microsoft.com/office/drawing/2016/SVG/main" r:embed="rId29"/>
+                        </a:ext>
+                      </a:extLst>
+                    </a:blip>
                     <a:srcRect/>
                     <a:stretch>
                       <a:fillRect/>
@@ -4009,7 +4195,7 @@
           <w:sz w:val="14"/>
           <w:szCs w:val="14"/>
         </w:rPr>
-        <w:t xml:space="preserve">Panel A: share of metal products in total exports to the EU. Panel B: additional carbon cost relative to the export value of CBAM-covered products; a higher index means higher adjustment cost.</w:t>
+        <w:t xml:space="preserve">Panel A: share of metal products in total exports to the EU. Panel B: additional carbon cost relative to the export value of CBAM-covered products; a higher index means a higher adjustment cost.</w:t>
       </w:r>
     </w:p>
     <w:p>
@@ -4032,57 +4218,37 @@
           <w:sz w:val="14"/>
           <w:szCs w:val="14"/>
         </w:rPr>
-        <w:t xml:space="preserve">Krungsri Research (2026) using Trade Map (2024) and World Bank</w:t>
+        <w:t xml:space="preserve">Trade Map (2024) and World Bank as compiled by Krungsri Research (2026)</w:t>
       </w:r>
     </w:p>
     <w:p>
       <w:pPr>
         <w:spacing w:after="140" w:line="288"/>
       </w:pPr>
-      <w:r>
-        <w:rPr>
-          <w:b/>
-          <w:bCs/>
-          <w:color w:val="2251FF"/>
-          <w:sz w:val="15"/>
-          <w:szCs w:val="15"/>
-        </w:rPr>
-        <w:t xml:space="preserve">[Inference]</w:t>
-      </w:r>
       <w:r>
         <w:rPr>
           <w:sz w:val="20"/>
           <w:szCs w:val="20"/>
         </w:rPr>
-        <w:t xml:space="preserve"> The two panels tell different stories for a clear reason. Most of Vietnam's metal exports are intermediate and finished products rather than upstream smelter output, so the carbon embedded per dollar exported is lower than Indonesia's. Taking dependence and adjustment cost together, Indonesia is the most affected country and Vietnam follows. Malaysia, Thailand and the Philippines face moderate impacts.</w:t>
+        <w:t xml:space="preserve">The two panels tell different stories for a clear reason. Most of Vietnam's metal exports are intermediate and finished products rather than upstream smelter output, so the carbon embedded per dollar exported is lower than Indonesia's. Taking dependence and adjustment cost together, Indonesia is the most affected country and Vietnam follows. Malaysia, Thailand and the Philippines face moderate impacts.</w:t>
       </w:r>
     </w:p>
     <w:p>
       <w:pPr>
         <w:spacing w:after="140" w:line="288"/>
       </w:pPr>
-      <w:r>
-        <w:rPr>
-          <w:b/>
-          <w:bCs/>
-          <w:color w:val="2251FF"/>
-          <w:sz w:val="15"/>
-          <w:szCs w:val="15"/>
-        </w:rPr>
-        <w:t xml:space="preserve">[Inference]</w:t>
-      </w:r>
       <w:r>
         <w:rPr>
           <w:sz w:val="20"/>
           <w:szCs w:val="20"/>
         </w:rPr>
-        <w:t xml:space="preserve"> That advantage may narrow. On 17 December 2025 the Commission proposed to extend CBAM to about 180 downstream steel and aluminium products and to tighten anti-circumvention rules.</w:t>
+        <w:t xml:space="preserve">That advantage may narrow. On 17 December 2025 the Commission proposed to extend CBAM to about 180 downstream steel and aluminium products and to tighten anti-circumvention rules.</w:t>
       </w:r>
       <w:r>
         <w:rPr>
           <w:rStyle w:val="FootnoteReference"/>
         </w:rPr>
-        <w:footnoteReference w:id="23"/>
+        <w:footnoteReference w:id="22"/>
       </w:r>
       <w:r>
         <w:rPr>
@@ -4095,7 +4261,7 @@
         <w:rPr>
           <w:rStyle w:val="FootnoteReference"/>
         </w:rPr>
-        <w:footnoteReference w:id="24"/>
+        <w:footnoteReference w:id="23"/>
       </w:r>
       <w:r>
         <w:rPr>
@@ -4108,7 +4274,7 @@
         <w:rPr>
           <w:rStyle w:val="FootnoteReference"/>
         </w:rPr>
-        <w:footnoteReference w:id="25"/>
+        <w:footnoteReference w:id="24"/>
       </w:r>
     </w:p>
     <w:p>
@@ -4124,7 +4290,7 @@
           <w:sz w:val="20"/>
           <w:szCs w:val="20"/>
         </w:rPr>
-        <w:t xml:space="preserve">CBAM: sizing the bill</w:t>
+        <w:t xml:space="preserve">The bill rises forty-fold by 2034</w:t>
       </w:r>
     </w:p>
     <w:p>
@@ -4142,37 +4308,20 @@
         <w:rPr>
           <w:rStyle w:val="FootnoteReference"/>
         </w:rPr>
-        <w:footnoteReference w:id="26"/>
+        <w:footnoteReference w:id="25"/>
       </w:r>
       <w:r>
         <w:rPr>
           <w:sz w:val="20"/>
           <w:szCs w:val="20"/>
         </w:rPr>
-        <w:t xml:space="preserve"> </w:t>
-      </w:r>
-      <w:r>
-        <w:rPr>
-          <w:b/>
-          <w:bCs/>
-          <w:color w:val="2251FF"/>
-          <w:sz w:val="15"/>
-          <w:szCs w:val="15"/>
-        </w:rPr>
-        <w:t xml:space="preserve">[Inference]</w:t>
-      </w:r>
-      <w:r>
-        <w:rPr>
-          <w:sz w:val="20"/>
-          <w:szCs w:val="20"/>
-        </w:rPr>
-        <w:t xml:space="preserve"> A simple model shows how the CBAM bill on that volume would grow. We take Vietnam's average intensity of 2.51 tonnes and an EU carbon price of EUR 78 per tonne, close to the 2026 average to August.</w:t>
+        <w:t xml:space="preserve"> To size the CBAM bill on that volume we apply Vietnam's average intensity of 2.51 tonnes and an EU carbon price of EUR 78 per tonne, close to the 2026 average to August.</w:t>
       </w:r>
       <w:r>
         <w:rPr>
           <w:rStyle w:val="FootnoteReference"/>
         </w:rPr>
-        <w:footnoteReference w:id="27"/>
+        <w:footnoteReference w:id="26"/>
       </w:r>
     </w:p>
     <w:p>
@@ -4190,7 +4339,7 @@
           <w:sz w:val="15"/>
           <w:szCs w:val="15"/>
         </w:rPr>
-        <w:t xml:space="preserve">EXHIBIT 7</w:t>
+        <w:t xml:space="preserve">EXHIBIT 8</w:t>
       </w:r>
     </w:p>
     <w:p>
@@ -4237,7 +4386,13 @@
                     </pic:cNvPicPr>
                   </pic:nvPicPr>
                   <pic:blipFill>
-                    <a:blip r:embed="rId23" cstate="none"/>
+                    <a:blip r:embed="rId32" cstate="none">
+                      <a:extLst>
+                        <a:ext uri="{96DAC541-7B7A-43D3-8B79-37D633B846F1}">
+                          <asvg:svgBlip xmlns:asvg="http://schemas.microsoft.com/office/drawing/2016/SVG/main" r:embed="rId31"/>
+                        </a:ext>
+                      </a:extLst>
+                    </a:blip>
                     <a:srcRect/>
                     <a:stretch>
                       <a:fillRect/>
@@ -4279,7 +4434,7 @@
           <w:sz w:val="14"/>
           <w:szCs w:val="14"/>
         </w:rPr>
-        <w:t xml:space="preserve">Panel A: 100% minus the CBAM factor under the EU ETS Directive. Panel B is illustrative: 2.08 Mt x emission intensity x EUR 78/t x share in Panel A. It holds volumes, prices and intensity constant and ignores the benchmark-based adjustment for free allocation, so it overstates the bill in the early years.</w:t>
+        <w:t xml:space="preserve">Panel A: 100% minus the CBAM factor under the EU ETS Directive. Panel B is an ABrighter Research scenario: 2.08 Mt x emission intensity x EUR 78/t x share in Panel A. It holds volumes, prices and intensity constant and ignores the benchmark-based adjustment for free allocation, so it overstates the bill in the early years.</w:t>
       </w:r>
     </w:p>
     <w:p>
@@ -4311,42 +4466,22 @@
       </w:pPr>
       <w:r>
         <w:rPr>
-          <w:b/>
-          <w:bCs/>
-          <w:color w:val="2251FF"/>
-          <w:sz w:val="15"/>
-          <w:szCs w:val="15"/>
-        </w:rPr>
-        <w:t xml:space="preserve">[Inference]</w:t>
-      </w:r>
-      <w:r>
-        <w:rPr>
           <w:sz w:val="20"/>
           <w:szCs w:val="20"/>
         </w:rPr>
-        <w:t xml:space="preserve"> In 2026 the bill comes to only about EUR 10 million. It rises to around EUR 198 million in 2030 as EU free allocation halves and to about EUR 407 million a year at full phase-in, or EUR 196 per tonne. Set against the unit value of steel sent to the EU in 2025, about USD 673 per tonne, EUR 196 equals 29% to 35% of the price for any euro-dollar rate between 1.0 and 1.2. Commodity steel margins cannot absorb that.</w:t>
+        <w:t xml:space="preserve">Our scenario puts the bill at only about EUR 10 million in 2026. It rises to around EUR 198 million in 2030 as EU free allocation halves and to about EUR 407 million a year at full phase-in, or EUR 196 per tonne. Set against the unit value of steel sent to the EU in 2025, about USD 673 per tonne, EUR 196 equals 29% to 35% of the price for any euro-dollar rate between 1.0 and 1.2. Commodity steel margins cannot absorb a cost of that size.</w:t>
       </w:r>
     </w:p>
     <w:p>
       <w:pPr>
         <w:spacing w:after="140" w:line="288"/>
       </w:pPr>
-      <w:r>
-        <w:rPr>
-          <w:b/>
-          <w:bCs/>
-          <w:color w:val="2251FF"/>
-          <w:sz w:val="15"/>
-          <w:szCs w:val="15"/>
-        </w:rPr>
-        <w:t xml:space="preserve">[Inference]</w:t>
-      </w:r>
       <w:r>
         <w:rPr>
           <w:sz w:val="20"/>
           <w:szCs w:val="20"/>
         </w:rPr>
-        <w:t xml:space="preserve"> The same model shows the reward for adapting. At the global average intensity the full bill falls to about EUR 300 million. For scrap-based electric arc furnaces (EAF) at about 0.5 tonnes it falls to about EUR 81 million. The gap between EUR 407 million and EUR 81 million is the value of decarbonising. Firms that cannot show verified data would pay on default values that are higher still.</w:t>
+        <w:t xml:space="preserve">The same scenario shows the reward for adapting. At the global average intensity the full bill falls to about EUR 300 million. For scrap-based electric arc furnaces (EAF) at about 0.5 tonnes it falls to about EUR 81 million. The gap between EUR 407 million and EUR 81 million is the value of decarbonising. Firms that cannot show verified data would pay on default values that are higher still.</w:t>
       </w:r>
     </w:p>
     <w:p>
@@ -4362,7 +4497,7 @@
           <w:sz w:val="26"/>
           <w:szCs w:val="26"/>
         </w:rPr>
-        <w:t xml:space="preserve">5. Tracing the forest</w:t>
+        <w:t xml:space="preserve">5. Coffee places Vietnam inside the EUDR</w:t>
       </w:r>
     </w:p>
     <w:p>
@@ -4380,7 +4515,7 @@
         <w:rPr>
           <w:rStyle w:val="FootnoteReference"/>
         </w:rPr>
-        <w:footnoteReference w:id="28"/>
+        <w:footnoteReference w:id="27"/>
       </w:r>
       <w:r>
         <w:rPr>
@@ -4405,7 +4540,7 @@
           <w:sz w:val="15"/>
           <w:szCs w:val="15"/>
         </w:rPr>
-        <w:t xml:space="preserve">EXHIBIT 8</w:t>
+        <w:t xml:space="preserve">EXHIBIT 9</w:t>
       </w:r>
     </w:p>
     <w:p>
@@ -4452,7 +4587,13 @@
                     </pic:cNvPicPr>
                   </pic:nvPicPr>
                   <pic:blipFill>
-                    <a:blip r:embed="rId24" cstate="none"/>
+                    <a:blip r:embed="rId34" cstate="none">
+                      <a:extLst>
+                        <a:ext uri="{96DAC541-7B7A-43D3-8B79-37D633B846F1}">
+                          <asvg:svgBlip xmlns:asvg="http://schemas.microsoft.com/office/drawing/2016/SVG/main" r:embed="rId33"/>
+                        </a:ext>
+                      </a:extLst>
+                    </a:blip>
                     <a:srcRect/>
                     <a:stretch>
                       <a:fillRect/>
@@ -4517,7 +4658,7 @@
           <w:sz w:val="14"/>
           <w:szCs w:val="14"/>
         </w:rPr>
-        <w:t xml:space="preserve">Krungsri Research (2026) using Trade Map (2024); MOIT (2025); European Commission; MAE (2025); ABrighter Research</w:t>
+        <w:t xml:space="preserve">Trade Map (2024) as compiled by Krungsri Research (2026); MOIT (2025); European Commission; MAE (2025); ABrighter Research</w:t>
       </w:r>
     </w:p>
     <w:p>
@@ -4529,7 +4670,7 @@
           <w:sz w:val="20"/>
           <w:szCs w:val="20"/>
         </w:rPr>
-        <w:t xml:space="preserve">Full application will affect ASEAN exports to differing degrees depending on each country's export structure. Indonesia is likely to be hit hardest because palm oil and timber made up 18.9% and 5.8% of its exports to the EU in 2024. Malaysia follows through palm oil and rubber. Thailand is affected through rubber. </w:t>
+        <w:t xml:space="preserve">Full application will affect ASEAN exports to differing degrees. Indonesia is likely to be hit hardest because palm oil and timber made up 18.9% and 5.8% of its exports to the EU in 2024. Malaysia follows through palm oil and rubber. Thailand is affected through rubber. </w:t>
       </w:r>
       <w:r>
         <w:rPr>
@@ -4551,7 +4692,7 @@
         <w:rPr>
           <w:rStyle w:val="FootnoteReference"/>
         </w:rPr>
-        <w:footnoteReference w:id="29"/>
+        <w:footnoteReference w:id="28"/>
       </w:r>
     </w:p>
     <w:p>
@@ -4569,31 +4710,27 @@
         <w:rPr>
           <w:rStyle w:val="FootnoteReference"/>
         </w:rPr>
-        <w:footnoteReference w:id="30"/>
+        <w:footnoteReference w:id="29"/>
       </w:r>
       <w:r>
         <w:rPr>
           <w:sz w:val="20"/>
           <w:szCs w:val="20"/>
         </w:rPr>
-        <w:t xml:space="preserve"> Germany, Italy and Spain were the three largest buyers with 13.7%, 7.8% and 7.1% of the total. </w:t>
-      </w:r>
-      <w:r>
-        <w:rPr>
-          <w:b/>
-          <w:bCs/>
-          <w:color w:val="2251FF"/>
-          <w:sz w:val="15"/>
-          <w:szCs w:val="15"/>
-        </w:rPr>
-        <w:t xml:space="preserve">[Inference]</w:t>
+        <w:t xml:space="preserve"> Germany, Italy and Spain were the three largest buyers with 13.7%, 7.8% and 7.1% of the total. On 2024 shares about USD 2.2 billion of coffee went to the EU in 2025. Wood and forest products earned a record USD 17.2 billion, of which around 5% went directly to the EU.</w:t>
+      </w:r>
+      <w:r>
+        <w:rPr>
+          <w:rStyle w:val="FootnoteReference"/>
+        </w:rPr>
+        <w:footnoteReference w:id="30"/>
       </w:r>
       <w:r>
         <w:rPr>
           <w:sz w:val="20"/>
           <w:szCs w:val="20"/>
         </w:rPr>
-        <w:t xml:space="preserve"> On 2024 shares about USD 2.2 billion of coffee went to the EU in 2025. Wood and forest products earned a record USD 17.2 billion, of which around 5% went directly to the EU.</w:t>
+        <w:t xml:space="preserve"> The rubber industry earned about USD 11 billion including processed goods. The EU took 7.4% of rubber export value.</w:t>
       </w:r>
       <w:r>
         <w:rPr>
@@ -4601,40 +4738,17 @@
         </w:rPr>
         <w:footnoteReference w:id="31"/>
       </w:r>
+    </w:p>
+    <w:p>
+      <w:pPr>
+        <w:spacing w:after="140" w:line="288"/>
+      </w:pPr>
       <w:r>
         <w:rPr>
           <w:sz w:val="20"/>
           <w:szCs w:val="20"/>
         </w:rPr>
-        <w:t xml:space="preserve"> The rubber industry earned about USD 11 billion including processed goods. The EU took 7.4% of rubber export value.</w:t>
-      </w:r>
-      <w:r>
-        <w:rPr>
-          <w:rStyle w:val="FootnoteReference"/>
-        </w:rPr>
-        <w:footnoteReference w:id="32"/>
-      </w:r>
-    </w:p>
-    <w:p>
-      <w:pPr>
-        <w:spacing w:after="140" w:line="288"/>
-      </w:pPr>
-      <w:r>
-        <w:rPr>
-          <w:b/>
-          <w:bCs/>
-          <w:color w:val="2251FF"/>
-          <w:sz w:val="15"/>
-          <w:szCs w:val="15"/>
-        </w:rPr>
-        <w:t xml:space="preserve">[Inference]</w:t>
-      </w:r>
-      <w:r>
-        <w:rPr>
-          <w:sz w:val="20"/>
-          <w:szCs w:val="20"/>
-        </w:rPr>
-        <w:t xml:space="preserve"> The coffee price boom changes the economics of compliance. The cost of mapping a plot or filing a due diligence statement does not rise with the price of coffee, yet the export value of the crop it protects rose by almost 60% in 2025. Compliance is therefore cheaper per dollar of sales than at any point in the last decade. If prices fall back before the systems are built, the same work will weigh more heavily on margins. The window to invest is now.</w:t>
+        <w:t xml:space="preserve">The coffee price boom changes the economics of compliance. The cost of mapping a plot or filing a due diligence statement does not rise with the price of coffee, yet the export value of the crop it protects rose by almost 60% in 2025. Compliance is therefore cheaper per dollar of sales than at any point in the last decade. If prices fall back before the systems are built, the same work will weigh more heavily on margins. The window to invest is now.</w:t>
       </w:r>
     </w:p>
     <w:p>
@@ -4668,62 +4782,45 @@
         <w:rPr>
           <w:rStyle w:val="FootnoteReference"/>
         </w:rPr>
-        <w:footnoteReference w:id="33"/>
+        <w:footnoteReference w:id="32"/>
       </w:r>
       <w:r>
         <w:rPr>
           <w:sz w:val="20"/>
           <w:szCs w:val="20"/>
         </w:rPr>
-        <w:t xml:space="preserve"> Only about 1% of operators sourcing from Vietnam will be checked. Simplified due diligence applies. </w:t>
-      </w:r>
-      <w:r>
-        <w:rPr>
-          <w:b/>
-          <w:bCs/>
-          <w:color w:val="2251FF"/>
-          <w:sz w:val="15"/>
-          <w:szCs w:val="15"/>
-        </w:rPr>
-        <w:t xml:space="preserve">[Inference]</w:t>
-      </w:r>
+        <w:t xml:space="preserve"> Only about 1% of operators sourcing from Vietnam will be checked and simplified due diligence applies. Low risk does not mean low work. Operators must still collect the geolocation of each plot and evidence of legal production. Two features of Vietnamese supply make this hard. Smallholders supply 63% of raw rubber and most of the coffee. Vietnam also imports raw material: more than 64% of its rubber imports come from Cambodia. Vietnam's low-risk status does not extend to land in another country.</w:t>
+      </w:r>
+    </w:p>
+    <w:p>
+      <w:pPr>
+        <w:spacing w:after="140" w:line="288"/>
+      </w:pPr>
       <w:r>
         <w:rPr>
           <w:sz w:val="20"/>
           <w:szCs w:val="20"/>
         </w:rPr>
-        <w:t xml:space="preserve"> Low risk does not mean low work. Operators must still collect the geolocation of each plot and evidence of legal production. Two features of Vietnamese supply make this hard. Smallholders supply 63% of raw rubber and most of the coffee. Vietnam also imports raw material: more than 64% of its rubber imports come from Cambodia. Vietnam's low-risk status does not cover land in another country.</w:t>
-      </w:r>
-    </w:p>
-    <w:p>
-      <w:pPr>
-        <w:spacing w:after="140" w:line="288"/>
-      </w:pPr>
+        <w:t xml:space="preserve">The domestic response has begun. The Ministry of Agriculture and Environment (MAE) has asked every province to publish forest boundary maps by 31 December 2026 and to identify coffee, rubber and timber areas at risk.</w:t>
+      </w:r>
+      <w:r>
+        <w:rPr>
+          <w:rStyle w:val="FootnoteReference"/>
+        </w:rPr>
+        <w:footnoteReference w:id="33"/>
+      </w:r>
       <w:r>
         <w:rPr>
           <w:sz w:val="20"/>
           <w:szCs w:val="20"/>
         </w:rPr>
-        <w:t xml:space="preserve">The domestic response has begun. The Ministry of Agriculture and Environment (MAE) has asked every province to publish forest boundary maps by 31 December 2026 and to identify coffee, rubber and timber areas at risk.</w:t>
+        <w:t xml:space="preserve"> Provinces in the Central Highlands are piloting deforestation-free coffee with plot polygons uploaded to mobile traceability systems. Early evidence suggests compliance can pay: Vietnam Rubber Group sold about 10,000 tonnes of EUDR-compliant rubber in 2025 and the first half of 2026 at a premium of USD 120 to 250 per tonne.</w:t>
       </w:r>
       <w:r>
         <w:rPr>
           <w:rStyle w:val="FootnoteReference"/>
         </w:rPr>
         <w:footnoteReference w:id="34"/>
-      </w:r>
-      <w:r>
-        <w:rPr>
-          <w:sz w:val="20"/>
-          <w:szCs w:val="20"/>
-        </w:rPr>
-        <w:t xml:space="preserve"> Provinces in the Central Highlands are piloting deforestation-free coffee with plot polygons uploaded to mobile traceability systems. Early evidence suggests compliance can pay: Vietnam Rubber Group sold about 10,000 tonnes of EUDR-compliant rubber in 2025 and the first half of 2026 at a premium of USD 120 to 250 per tonne.</w:t>
-      </w:r>
-      <w:r>
-        <w:rPr>
-          <w:rStyle w:val="FootnoteReference"/>
-        </w:rPr>
-        <w:footnoteReference w:id="35"/>
       </w:r>
     </w:p>
     <w:p>
@@ -4739,7 +4836,7 @@
           <w:sz w:val="26"/>
           <w:szCs w:val="26"/>
         </w:rPr>
-        <w:t xml:space="preserve">6. Combining the two measures</w:t>
+        <w:t xml:space="preserve">6. Together the two measures cover a quarter of exports to the EU</w:t>
       </w:r>
     </w:p>
     <w:p>
@@ -4812,7 +4909,7 @@
         <w:gridCol w:w="1408"/>
         <w:gridCol w:w="1408"/>
         <w:gridCol w:w="1408"/>
-        <w:gridCol w:w="1408"/>
+        <w:gridCol w:w="1406"/>
       </w:tblGrid>
       <w:tr>
         <w:trPr>
@@ -5036,7 +5133,7 @@
         </w:tc>
         <w:tc>
           <w:tcPr>
-            <w:tcW w:type="dxa" w:w="1408"/>
+            <w:tcW w:type="dxa" w:w="1406"/>
             <w:tcBorders>
               <w:top w:val="none" w:color="FFFFFF" w:sz="0"/>
               <w:left w:val="none" w:color="FFFFFF" w:sz="0"/>
@@ -5280,7 +5377,7 @@
         </w:tc>
         <w:tc>
           <w:tcPr>
-            <w:tcW w:type="dxa" w:w="1408"/>
+            <w:tcW w:type="dxa" w:w="1406"/>
             <w:tcBorders>
               <w:top w:val="none" w:color="FFFFFF" w:sz="0"/>
               <w:left w:val="none" w:color="FFFFFF" w:sz="0"/>
@@ -5522,7 +5619,7 @@
         </w:tc>
         <w:tc>
           <w:tcPr>
-            <w:tcW w:type="dxa" w:w="1408"/>
+            <w:tcW w:type="dxa" w:w="1406"/>
             <w:tcBorders>
               <w:top w:val="none" w:color="FFFFFF" w:sz="0"/>
               <w:left w:val="none" w:color="FFFFFF" w:sz="0"/>
@@ -5776,7 +5873,7 @@
         </w:tc>
         <w:tc>
           <w:tcPr>
-            <w:tcW w:type="dxa" w:w="1408"/>
+            <w:tcW w:type="dxa" w:w="1406"/>
             <w:tcBorders>
               <w:top w:val="none" w:color="FFFFFF" w:sz="0"/>
               <w:left w:val="none" w:color="FFFFFF" w:sz="0"/>
@@ -6033,7 +6130,7 @@
         </w:tc>
         <w:tc>
           <w:tcPr>
-            <w:tcW w:type="dxa" w:w="1408"/>
+            <w:tcW w:type="dxa" w:w="1406"/>
             <w:tcBorders>
               <w:top w:val="none" w:color="FFFFFF" w:sz="0"/>
               <w:left w:val="none" w:color="FFFFFF" w:sz="0"/>
@@ -6288,7 +6385,7 @@
         </w:tc>
         <w:tc>
           <w:tcPr>
-            <w:tcW w:type="dxa" w:w="1408"/>
+            <w:tcW w:type="dxa" w:w="1406"/>
             <w:tcBorders>
               <w:top w:val="none" w:color="FFFFFF" w:sz="0"/>
               <w:left w:val="none" w:color="FFFFFF" w:sz="0"/>
@@ -6545,7 +6642,7 @@
         </w:tc>
         <w:tc>
           <w:tcPr>
-            <w:tcW w:type="dxa" w:w="1408"/>
+            <w:tcW w:type="dxa" w:w="1406"/>
             <w:tcBorders>
               <w:top w:val="none" w:color="FFFFFF" w:sz="0"/>
               <w:left w:val="none" w:color="FFFFFF" w:sz="0"/>
@@ -6800,7 +6897,7 @@
         </w:tc>
         <w:tc>
           <w:tcPr>
-            <w:tcW w:type="dxa" w:w="1408"/>
+            <w:tcW w:type="dxa" w:w="1406"/>
             <w:tcBorders>
               <w:top w:val="none" w:color="FFFFFF" w:sz="0"/>
               <w:left w:val="none" w:color="FFFFFF" w:sz="0"/>
@@ -7057,7 +7154,7 @@
         </w:tc>
         <w:tc>
           <w:tcPr>
-            <w:tcW w:type="dxa" w:w="1408"/>
+            <w:tcW w:type="dxa" w:w="1406"/>
             <w:tcBorders>
               <w:top w:val="none" w:color="FFFFFF" w:sz="0"/>
               <w:left w:val="none" w:color="FFFFFF" w:sz="0"/>
@@ -7118,7 +7215,7 @@
           <w:sz w:val="14"/>
           <w:szCs w:val="14"/>
         </w:rPr>
-        <w:t xml:space="preserve">Krungsri Research (2026) using Trade Map (2024). Cattle and soya are below 0.5% for all five economies.</w:t>
+        <w:t xml:space="preserve">Trade Map (2024) as compiled by Krungsri Research (2026). Cattle and soya are below 0.5% for all five economies.</w:t>
       </w:r>
     </w:p>
     <w:p>
@@ -7162,6 +7259,131 @@
         </w:rPr>
         <w:t xml:space="preserve">██████</w:t>
       </w:r>
+    </w:p>
+    <w:tbl>
+      <w:tblPr>
+        <w:tblW w:type="dxa" w:w="9638"/>
+        <w:tblBorders>
+          <w:top w:val="none" w:color="FFFFFF" w:sz="0"/>
+          <w:left w:val="none" w:color="FFFFFF" w:sz="0"/>
+          <w:bottom w:val="none" w:color="FFFFFF" w:sz="0"/>
+          <w:right w:val="none" w:color="FFFFFF" w:sz="0"/>
+          <w:insideH w:val="none" w:color="FFFFFF" w:sz="0"/>
+          <w:insideV w:val="none" w:color="FFFFFF" w:sz="0"/>
+        </w:tblBorders>
+      </w:tblPr>
+      <w:tblGrid>
+        <w:gridCol w:w="9638"/>
+      </w:tblGrid>
+      <w:tr>
+        <w:tc>
+          <w:tcPr>
+            <w:tcW w:type="dxa" w:w="9638"/>
+            <w:tcBorders>
+              <w:top w:val="none" w:color="FFFFFF" w:sz="0"/>
+              <w:left w:val="single" w:color="2251FF" w:sz="24"/>
+              <w:bottom w:val="none" w:color="FFFFFF" w:sz="0"/>
+              <w:right w:val="none" w:color="FFFFFF" w:sz="0"/>
+            </w:tcBorders>
+            <w:shd w:fill="EEF3FF" w:color="auto" w:val="clear"/>
+            <w:tcMar>
+              <w:top w:type="dxa" w:w="240"/>
+              <w:left w:type="dxa" w:w="280"/>
+              <w:bottom w:type="dxa" w:w="180"/>
+              <w:right w:type="dxa" w:w="280"/>
+            </w:tcMar>
+          </w:tcPr>
+          <w:p>
+            <w:pPr>
+              <w:spacing w:after="80"/>
+            </w:pPr>
+            <w:r>
+              <w:rPr>
+                <w:b/>
+                <w:bCs/>
+                <w:color w:val="2251FF"/>
+                <w:spacing w:val="40"/>
+                <w:sz w:val="15"/>
+                <w:szCs w:val="15"/>
+              </w:rPr>
+              <w:t xml:space="preserve">KEY MESSAGE</w:t>
+            </w:r>
+          </w:p>
+          <w:p>
+            <w:pPr>
+              <w:spacing w:after="140" w:line="290"/>
+            </w:pPr>
+            <w:r>
+              <w:rPr>
+                <w:rFonts w:ascii="Georgia" w:cs="Georgia" w:eastAsia="Georgia" w:hAnsi="Georgia"/>
+                <w:color w:val="051C2C"/>
+                <w:sz w:val="25"/>
+                <w:szCs w:val="25"/>
+              </w:rPr>
+              <w:t xml:space="preserve">Vietnam is the only large ASEAN economy rated 'High'. It has written most of the required instruments into law; delivery is now the constraint.</w:t>
+            </w:r>
+          </w:p>
+          <w:p>
+            <w:pPr>
+              <w:pStyle w:val="ListParagraph"/>
+              <w:numPr>
+                <w:ilvl w:val="0"/>
+                <w:numId w:val="2"/>
+              </w:numPr>
+              <w:spacing w:after="70" w:line="264"/>
+            </w:pPr>
+            <w:r>
+              <w:rPr>
+                <w:color w:val="051C2C"/>
+                <w:sz w:val="18"/>
+                <w:szCs w:val="18"/>
+              </w:rPr>
+              <w:t xml:space="preserve">The rating combines overall exposure, product-level exposure and exposure to CBAM and the EUDR.</w:t>
+            </w:r>
+          </w:p>
+          <w:p>
+            <w:pPr>
+              <w:pStyle w:val="ListParagraph"/>
+              <w:numPr>
+                <w:ilvl w:val="0"/>
+                <w:numId w:val="2"/>
+              </w:numPr>
+              <w:spacing w:after="70" w:line="264"/>
+            </w:pPr>
+            <w:r>
+              <w:rPr>
+                <w:color w:val="051C2C"/>
+                <w:sz w:val="18"/>
+                <w:szCs w:val="18"/>
+              </w:rPr>
+              <w:t xml:space="preserve">Investment incentives and clean-energy plans are in place but reach exporters slowly.</w:t>
+            </w:r>
+          </w:p>
+          <w:p>
+            <w:pPr>
+              <w:pStyle w:val="ListParagraph"/>
+              <w:numPr>
+                <w:ilvl w:val="0"/>
+                <w:numId w:val="2"/>
+              </w:numPr>
+              <w:spacing w:after="70" w:line="264"/>
+            </w:pPr>
+            <w:r>
+              <w:rPr>
+                <w:color w:val="051C2C"/>
+                <w:sz w:val="18"/>
+                <w:szCs w:val="18"/>
+              </w:rPr>
+              <w:t xml:space="preserve">Verification systems, plot data and green finance are the gaps that matter most.</w:t>
+            </w:r>
+          </w:p>
+        </w:tc>
+      </w:tr>
+    </w:tbl>
+    <w:p>
+      <w:pPr>
+        <w:spacing w:after="220"/>
+      </w:pPr>
     </w:p>
     <w:p>
       <w:pPr>
@@ -7711,7 +7933,7 @@
                 <w:sz w:val="15"/>
                 <w:szCs w:val="15"/>
               </w:rPr>
-              <w:t xml:space="preserve">1) Overall export exposure (Exhibit 4)</w:t>
+              <w:t xml:space="preserve">1) Overall export exposure (Exhibit 5)</w:t>
             </w:r>
           </w:p>
         </w:tc>
@@ -7931,7 +8153,7 @@
                 <w:sz w:val="15"/>
                 <w:szCs w:val="15"/>
               </w:rPr>
-              <w:t xml:space="preserve">2) Product-level exposure (Exhibits 4 and 5)</w:t>
+              <w:t xml:space="preserve">2) Product-level exposure (Exhibits 5 and 6)</w:t>
             </w:r>
           </w:p>
         </w:tc>
@@ -8462,29 +8684,19 @@
           <w:sz w:val="26"/>
           <w:szCs w:val="26"/>
         </w:rPr>
-        <w:t xml:space="preserve">Reading Vietnam's rating</w:t>
+        <w:t xml:space="preserve">A 'High' rating reflects success in Europe rather than failure</w:t>
       </w:r>
     </w:p>
     <w:p>
       <w:pPr>
         <w:spacing w:after="140" w:line="288"/>
       </w:pPr>
-      <w:r>
-        <w:rPr>
-          <w:b/>
-          <w:bCs/>
-          <w:color w:val="2251FF"/>
-          <w:sz w:val="15"/>
-          <w:szCs w:val="15"/>
-        </w:rPr>
-        <w:t xml:space="preserve">[Inference]</w:t>
-      </w:r>
       <w:r>
         <w:rPr>
           <w:sz w:val="20"/>
           <w:szCs w:val="20"/>
         </w:rPr>
-        <w:t xml:space="preserve"> A 'High' rating describes exposure and not failure. Vietnam is exposed because it has succeeded in the EU market and sells more there relative to its economy than any peer. Table 4 sets out the evidence behind each dimension of the rating and what has changed since 2024.</w:t>
+        <w:t xml:space="preserve">Vietnam is exposed because it has succeeded in the EU market and sells more there relative to its economy than any peer. Table 4 sets out the evidence behind each dimension of the rating and what has changed since 2024.</w:t>
       </w:r>
     </w:p>
     <w:p>
@@ -8725,18 +8937,7 @@
                 <w:sz w:val="15"/>
                 <w:szCs w:val="15"/>
               </w:rPr>
-              <w:t xml:space="preserve">What it means for Vietnam </w:t>
-            </w:r>
-            <w:r>
-              <w:rPr>
-                <w:rFonts w:ascii="Arial" w:cs="Arial" w:eastAsia="Arial" w:hAnsi="Arial"/>
-                <w:b/>
-                <w:bCs/>
-                <w:color w:val="99C2FF"/>
-                <w:sz w:val="15"/>
-                <w:szCs w:val="15"/>
-              </w:rPr>
-              <w:t xml:space="preserve">[Inference]</w:t>
+              <w:t xml:space="preserve">What it means for Vietnam</w:t>
             </w:r>
           </w:p>
         </w:tc>
@@ -9342,7 +9543,7 @@
           <w:sz w:val="26"/>
           <w:szCs w:val="26"/>
         </w:rPr>
-        <w:t xml:space="preserve">How Vietnam is responding</w:t>
+        <w:t xml:space="preserve">Vietnam has the laws but delivery is the constraint</w:t>
       </w:r>
     </w:p>
     <w:p>
@@ -9398,29 +9599,19 @@
           <w:sz w:val="20"/>
           <w:szCs w:val="20"/>
         </w:rPr>
-        <w:t xml:space="preserve">Krungsri Research rated Vietnam's enabling infrastructure 'Medium', behind Thailand and Malaysia. Its investment promotion targets renewable energy, research and development in green technology and a Green Credit Programme of soft loans for green investment. On regulation it highlighted the amendment of product standards legislation to introduce digital certification and require traceability. Table 5 sets out the instruments behind that assessment and the gaps we see.</w:t>
+        <w:t xml:space="preserve">Vietnam's enabling infrastructure rates 'Medium' in the regional comparison, behind Thailand and Malaysia. Its investment promotion targets renewable energy, research and development in green technology and a Green Credit Programme of soft loans for green investment. On regulation it has amended its product standards legislation to introduce digital certification and require traceability. Table 5 sets out the instruments and the gaps we see.</w:t>
       </w:r>
     </w:p>
     <w:p>
       <w:pPr>
         <w:spacing w:after="140" w:line="288"/>
       </w:pPr>
-      <w:r>
-        <w:rPr>
-          <w:b/>
-          <w:bCs/>
-          <w:color w:val="2251FF"/>
-          <w:sz w:val="15"/>
-          <w:szCs w:val="15"/>
-        </w:rPr>
-        <w:t xml:space="preserve">[Inference]</w:t>
-      </w:r>
       <w:r>
         <w:rPr>
           <w:sz w:val="20"/>
           <w:szCs w:val="20"/>
         </w:rPr>
-        <w:t xml:space="preserve"> The comparison with neighbours is instructive. Malaysia and Indonesia built national certification schemes for their main EUDR commodity, the Malaysian Sustainable Palm Oil (MSPO) and Indonesian Sustainable Palm Oil (ISPO) standards. Thailand's Cabinet approved an excise carbon tax on high-emission products to offset cross-border carbon price differences. Vietnam has no national certification scheme of the same weight for coffee or rubber and no carbon tax. Its carbon market pilot is the closest equivalent. Here the gap is not of intent but of instruments that a foreign regulator can recognise.</w:t>
+        <w:t xml:space="preserve">The comparison with neighbours is instructive. Malaysia and Indonesia built national certification schemes for their main EUDR commodity: the Malaysian Sustainable Palm Oil (MSPO) and Indonesian Sustainable Palm Oil (ISPO) standards. Thailand's Cabinet approved an excise carbon tax on high-emission products to offset cross-border carbon price differences. Vietnam has no national certification scheme of the same weight for coffee or rubber and has not adopted a comparable carbon tax. Its carbon market pilot is the closest equivalent. The gap is therefore not one of intent but of instruments that a foreign regulator can recognise.</w:t>
       </w:r>
     </w:p>
     <w:p>
@@ -9458,7 +9649,7 @@
           <w:sz w:val="21"/>
           <w:szCs w:val="21"/>
         </w:rPr>
-        <w:t xml:space="preserve">Vietnam has the main instruments in place: delivery capacity is now the constraint</w:t>
+        <w:t xml:space="preserve">Vietnam has the main instruments in place and delivery capacity is now the constraint</w:t>
       </w:r>
     </w:p>
     <w:tbl>
@@ -9661,18 +9852,7 @@
                 <w:sz w:val="15"/>
                 <w:szCs w:val="15"/>
               </w:rPr>
-              <w:t xml:space="preserve">Gap we see </w:t>
-            </w:r>
-            <w:r>
-              <w:rPr>
-                <w:rFonts w:ascii="Arial" w:cs="Arial" w:eastAsia="Arial" w:hAnsi="Arial"/>
-                <w:b/>
-                <w:bCs/>
-                <w:color w:val="99C2FF"/>
-                <w:sz w:val="15"/>
-                <w:szCs w:val="15"/>
-              </w:rPr>
-              <w:t xml:space="preserve">[Inference]</w:t>
+              <w:t xml:space="preserve">Gap we see</w:t>
             </w:r>
           </w:p>
         </w:tc>
@@ -10834,35 +11014,25 @@
           <w:sz w:val="14"/>
           <w:szCs w:val="14"/>
         </w:rPr>
-        <w:t xml:space="preserve">Government of Vietnam; MOIT; MAE; Krungsri Research (2026); ABrighter Research</w:t>
+        <w:t xml:space="preserve">Government of Vietnam; MOIT; MAE; ABrighter Research</w:t>
       </w:r>
     </w:p>
     <w:p>
       <w:pPr>
         <w:spacing w:after="140" w:line="288"/>
       </w:pPr>
-      <w:r>
-        <w:rPr>
-          <w:b/>
-          <w:bCs/>
-          <w:color w:val="2251FF"/>
-          <w:sz w:val="15"/>
-          <w:szCs w:val="15"/>
-        </w:rPr>
-        <w:t xml:space="preserve">[Inference]</w:t>
-      </w:r>
       <w:r>
         <w:rPr>
           <w:sz w:val="20"/>
           <w:szCs w:val="20"/>
         </w:rPr>
-        <w:t xml:space="preserve"> The ledger is mixed. On paper Vietnam has moved quickly: most of the instruments that EU buyers will ask about now exist in Vietnamese law. In practice the binding constraint has moved from legislation to delivery. Delivery depends on ministries that share data, provinces that map land, laboratories and verifiers that win foreign recognition and banks that price transition risk. The pilot carbon market illustrates the point. Allowances of 243.1 million tCO2e for 2025 and 268.4 million for 2026 have been allocated to 34 power plants, 25 steel mills and 51 cement plants, which together emit about 40% of national emissions.</w:t>
+        <w:t xml:space="preserve">On paper Vietnam has moved quickly: most of the instruments that EU buyers will ask about now exist in Vietnamese law. In practice the binding constraint has moved from legislation to delivery. Delivery depends on ministries that share data, provinces that map land, laboratories and verifiers that win foreign recognition and banks that price transition risk. The pilot carbon market illustrates the point. Allowances of 243.1 million tCO2e for 2025 and 268.4 million for 2026 have been allocated to 34 power plants, 25 steel mills and 51 cement plants, which together account for about 40% of national emissions.</w:t>
       </w:r>
       <w:r>
         <w:rPr>
           <w:rStyle w:val="FootnoteReference"/>
         </w:rPr>
-        <w:footnoteReference w:id="36"/>
+        <w:footnoteReference w:id="35"/>
       </w:r>
       <w:r>
         <w:rPr>
@@ -10878,20 +11048,10 @@
       </w:pPr>
       <w:r>
         <w:rPr>
-          <w:b/>
-          <w:bCs/>
-          <w:color w:val="2251FF"/>
-          <w:sz w:val="15"/>
-          <w:szCs w:val="15"/>
-        </w:rPr>
-        <w:t xml:space="preserve">[Inference]</w:t>
-      </w:r>
-      <w:r>
-        <w:rPr>
           <w:sz w:val="20"/>
           <w:szCs w:val="20"/>
         </w:rPr>
-        <w:t xml:space="preserve"> The two-column ledger is therefore clear. On the credit side Vietnam has a low-risk EUDR status, a falling rate of food-safety alerts, a growing renewable power base and a legal basis for traceability. On the debit side it has a steel sector with high emission intensity, a smallholder supply base without plot data and verification systems that the EU does not yet recognise. The credit side was mostly built by law and decree. The debit side can only be cleared by investment and by data collected farm by farm and plant by plant.</w:t>
+        <w:t xml:space="preserve">The ledger is therefore clear. On the credit side Vietnam has a low-risk EUDR status, a falling rate of food-safety alerts, a growing renewable power base and a legal basis for traceability. On the debit side it has a steel sector with high emission intensity, a smallholder supply base without plot data and verification systems that the EU does not yet recognise. The credit side was mostly built by law and decree. The debit side can only be cleared by investment and by data collected farm by farm and plant by plant.</w:t>
       </w:r>
     </w:p>
     <w:p>
@@ -10981,7 +11141,7 @@
                 <w:sz w:val="20"/>
                 <w:szCs w:val="20"/>
               </w:rPr>
-              <w:t xml:space="preserve">The enforcement of NTMs by Vietnam's main trading partners, particularly the EU and the United States, will continue to intensify. These partners increasingly put environmental, sustainability and safety standards at the centre of trade policy. The impact does not stop at the finished export. It runs through the whole supply chain, from sourcing raw materials to production processes and traceability. It forces firms to adapt at several levels at once. This will raise Vietnam's export costs and may become a structural challenge to its long-term competitiveness.</w:t>
+              <w:t xml:space="preserve">The enforcement of NTMs by Vietnam's main trading partners, particularly the EU and the United States, will continue to intensify. These partners increasingly put environmental, sustainability and safety standards at the centre of trade policy. The impact runs through the whole supply chain, from sourcing raw materials to production processes and traceability. It forces firms to adapt at several levels at once. This will raise Vietnam's export costs and may become a structural challenge to its long-term competitiveness unless the response is faster than the rules.</w:t>
             </w:r>
           </w:p>
         </w:tc>
@@ -11001,7 +11161,7 @@
           <w:sz w:val="20"/>
           <w:szCs w:val="20"/>
         </w:rPr>
-        <w:t xml:space="preserve">We would expect the cost to rise in stages rather than in one step. In the second half of 2026 the pressure will fall on steel data and on EUDR commodities. From 2027 CBAM certificates must be bought and the bill grows with each year of phase-in. From 2030 the carbon cost will be large enough to influence where steel and aluminium products are made. The pressure may not be uniform across sectors, as electronics, the largest export, faces fewer immediate obligations than its size suggests.</w:t>
+        <w:t xml:space="preserve">We would expect the cost to rise in stages rather than in one step. In the second half of 2026 the pressure will fall on steel data and on EUDR commodities. From 2027 CBAM certificates must be bought and the bill grows with each year of phase-in. From 2030 the carbon cost will be large enough to influence where steel and aluminium products are made. The pressure will not be uniform across sectors, as electronics, the largest export, faces fewer immediate obligations than its size suggests.</w:t>
       </w:r>
     </w:p>
     <w:p>
@@ -11013,7 +11173,7 @@
           <w:sz w:val="20"/>
           <w:szCs w:val="20"/>
         </w:rPr>
-        <w:t xml:space="preserve">Vietnam has accelerated its response. However, production restructuring needs an enabling regulatory environment, investment in infrastructure such as clean energy and research and development to advance manufacturing technology. These are the mechanisms that upgrade industries across the supply chain. Several actions are required.</w:t>
+        <w:t xml:space="preserve">Vietnam has accelerated its response. Production restructuring, however, needs an enabling regulatory environment, investment in infrastructure such as clean energy and research and development to advance manufacturing technology. These are the mechanisms that upgrade industries across the supply chain. Several actions are required.</w:t>
       </w:r>
     </w:p>
     <w:p>
@@ -11061,31 +11221,14 @@
         <w:rPr>
           <w:rStyle w:val="FootnoteReference"/>
         </w:rPr>
-        <w:footnoteReference w:id="37"/>
+        <w:footnoteReference w:id="36"/>
       </w:r>
       <w:r>
         <w:rPr>
           <w:sz w:val="20"/>
           <w:szCs w:val="20"/>
         </w:rPr>
-        <w:t xml:space="preserve"> </w:t>
-      </w:r>
-      <w:r>
-        <w:rPr>
-          <w:b/>
-          <w:bCs/>
-          <w:color w:val="2251FF"/>
-          <w:sz w:val="15"/>
-          <w:szCs w:val="15"/>
-        </w:rPr>
-        <w:t xml:space="preserve">[Inference]</w:t>
-      </w:r>
-      <w:r>
-        <w:rPr>
-          <w:sz w:val="20"/>
-          <w:szCs w:val="20"/>
-        </w:rPr>
-        <w:t xml:space="preserve"> Every euro that Vietnamese steelmakers pay into a credible domestic carbon market is a euro that need not be paid in Brussels. The pilot that runs to 2028 should be built from the start with MRV the EU will accept.</w:t>
+        <w:t xml:space="preserve"> Every euro that Vietnamese steelmakers pay into a credible domestic carbon market is a euro that need not be paid in Brussels. The pilot that runs to 2028 should be built from the start with MRV that the EU will accept.</w:t>
       </w:r>
     </w:p>
     <w:p>
@@ -11106,24 +11249,7 @@
           <w:sz w:val="20"/>
           <w:szCs w:val="20"/>
         </w:rPr>
-        <w:t xml:space="preserve"> </w:t>
-      </w:r>
-      <w:r>
-        <w:rPr>
-          <w:b/>
-          <w:bCs/>
-          <w:color w:val="2251FF"/>
-          <w:sz w:val="15"/>
-          <w:szCs w:val="15"/>
-        </w:rPr>
-        <w:t xml:space="preserve">[Inference]</w:t>
-      </w:r>
-      <w:r>
-        <w:rPr>
-          <w:sz w:val="20"/>
-          <w:szCs w:val="20"/>
-        </w:rPr>
-        <w:t xml:space="preserve"> Our illustrative model shows that moving from Vietnam's average steel intensity to scrap-based EAF cuts the bill at full phase-in from about EUR 407 million to about EUR 81 million a year. Clean power is the precondition, because an EAF running on coal-fired power keeps much of the emissions. The revised PDP8 and direct power purchase under Decree 57/2025 provide the tools.</w:t>
+        <w:t xml:space="preserve"> Our scenario shows that moving from Vietnam's average steel intensity to scrap-based EAF cuts the bill at full phase-in from about EUR 407 million to about EUR 81 million a year. Clean power is the precondition, because an EAF running on coal-fired power keeps much of the emissions. The revised PDP8 and direct power purchase under Decree 57/2025 provide the tools.</w:t>
       </w:r>
     </w:p>
     <w:p>
@@ -11174,20 +11300,10 @@
       </w:pPr>
       <w:r>
         <w:rPr>
-          <w:b/>
-          <w:bCs/>
-          <w:color w:val="2251FF"/>
-          <w:sz w:val="15"/>
-          <w:szCs w:val="15"/>
-        </w:rPr>
-        <w:t xml:space="preserve">[Inference]</w:t>
-      </w:r>
-      <w:r>
-        <w:rPr>
           <w:sz w:val="20"/>
           <w:szCs w:val="20"/>
         </w:rPr>
-        <w:t xml:space="preserve"> One bottleneck deserves plain language. Many smallholders will not fail the EU test because they cleared forest. They will fail because nobody has drawn the boundary of their plot or confirmed that they hold the land legally. Paperwork, rather than deforestation, is the most likely reason a Vietnamese coffee bean is turned away in 2027.</w:t>
+        <w:t xml:space="preserve">One bottleneck deserves plain language. Many smallholders will not fail the EU test because they cleared forest. They will fail because nobody has drawn the boundary of their plot or confirmed that they hold the land legally. Paperwork, rather than deforestation, is the most likely reason a Vietnamese coffee bean is turned away in 2027.</w:t>
       </w:r>
     </w:p>
     <w:p>
@@ -11205,7 +11321,7 @@
           <w:sz w:val="15"/>
           <w:szCs w:val="15"/>
         </w:rPr>
-        <w:t xml:space="preserve">EXHIBIT 9</w:t>
+        <w:t xml:space="preserve">EXHIBIT 10</w:t>
       </w:r>
     </w:p>
     <w:p>
@@ -11236,7 +11352,7 @@
       <w:r>
         <w:drawing>
           <wp:inline distT="0" distB="0" distL="0" distR="0">
-            <wp:extent cx="6115050" cy="4219575"/>
+            <wp:extent cx="6115050" cy="4191000"/>
             <wp:effectExtent t="0" r="0" b="0" l="0"/>
             <wp:docPr id="1" name="" descr="" title=""/>
             <wp:cNvGraphicFramePr>
@@ -11252,7 +11368,13 @@
                     </pic:cNvPicPr>
                   </pic:nvPicPr>
                   <pic:blipFill>
-                    <a:blip r:embed="rId25" cstate="none"/>
+                    <a:blip r:embed="rId36" cstate="none">
+                      <a:extLst>
+                        <a:ext uri="{96DAC541-7B7A-43D3-8B79-37D633B846F1}">
+                          <asvg:svgBlip xmlns:asvg="http://schemas.microsoft.com/office/drawing/2016/SVG/main" r:embed="rId35"/>
+                        </a:ext>
+                      </a:extLst>
+                    </a:blip>
                     <a:srcRect/>
                     <a:stretch>
                       <a:fillRect/>
@@ -11261,7 +11383,7 @@
                   <pic:spPr bwMode="auto">
                     <a:xfrm>
                       <a:off x="0" y="0"/>
-                      <a:ext cx="6115050" cy="4219575"/>
+                      <a:ext cx="6115050" cy="4191000"/>
                     </a:xfrm>
                     <a:prstGeom prst="rect">
                       <a:avLst/>
@@ -11294,7 +11416,7 @@
           <w:sz w:val="14"/>
           <w:szCs w:val="14"/>
         </w:rPr>
-        <w:t xml:space="preserve">Indicative sequencing by ABrighter Research. Each phase builds on the data and capacity of the one before.</w:t>
+        <w:t xml:space="preserve">Indicative sequencing by ABrighter Research. Each stage builds on the data and capacity of the one before.</w:t>
       </w:r>
     </w:p>
     <w:p>
@@ -11335,7 +11457,7 @@
         <w:rPr>
           <w:rStyle w:val="FootnoteReference"/>
         </w:rPr>
-        <w:footnoteReference w:id="38"/>
+        <w:footnoteReference w:id="37"/>
       </w:r>
       <w:r>
         <w:rPr>
@@ -11348,14 +11470,14 @@
         <w:rPr>
           <w:rStyle w:val="FootnoteReference"/>
         </w:rPr>
-        <w:footnoteReference w:id="39"/>
+        <w:footnoteReference w:id="38"/>
       </w:r>
       <w:r>
         <w:rPr>
           <w:sz w:val="20"/>
           <w:szCs w:val="20"/>
         </w:rPr>
-        <w:t xml:space="preserve"> Vietnam has everything to play for. The gate is narrow but it is open.</w:t>
+        <w:t xml:space="preserve"> Vietnam has everything to play for. The rules from Brussels can be a wall or a bridge. Which one they become will be decided in Vietnam.</w:t>
       </w:r>
     </w:p>
     <w:p>
@@ -15331,43 +15453,7 @@
           <w:sz w:val="15"/>
           <w:szCs w:val="15"/>
         </w:rPr>
-        <w:t xml:space="preserve">All paragraphs that rely on our own calculations or interpretation are labelled </w:t>
-      </w:r>
-      <w:r>
-        <w:rPr>
-          <w:b/>
-          <w:bCs/>
-          <w:color w:val="2251FF"/>
-          <w:sz w:val="15"/>
-          <w:szCs w:val="15"/>
-        </w:rPr>
-        <w:t xml:space="preserve">[Inference]</w:t>
-      </w:r>
-      <w:r>
-        <w:rPr>
-          <w:color w:val="6B7785"/>
-          <w:sz w:val="15"/>
-          <w:szCs w:val="15"/>
-        </w:rPr>
-        <w:t xml:space="preserve">. Statements we could not check against a primary source are labelled </w:t>
-      </w:r>
-      <w:r>
-        <w:rPr>
-          <w:b/>
-          <w:bCs/>
-          <w:color w:val="2251FF"/>
-          <w:sz w:val="15"/>
-          <w:szCs w:val="15"/>
-        </w:rPr>
-        <w:t xml:space="preserve">[Unverified]</w:t>
-      </w:r>
-      <w:r>
-        <w:rPr>
-          <w:color w:val="6B7785"/>
-          <w:sz w:val="15"/>
-          <w:szCs w:val="15"/>
-        </w:rPr>
-        <w:t xml:space="preserve">.</w:t>
+        <w:t xml:space="preserve">Figures described in the text as our estimate, our calculation or our scenario are ABrighter Research derivations from the sources shown. Their arithmetic is set out above. Peer comparisons use the 2024 regional dataset compiled by Krungsri Research (2026) from Trade Map and CEIC.</w:t>
       </w:r>
     </w:p>
     <w:p>
@@ -16802,88 +16888,780 @@
     <w:p>
       <w:pPr>
         <w:pageBreakBefore/>
-        <w:spacing w:after="200" w:before="600"/>
-      </w:pPr>
-      <w:r>
-        <w:drawing>
-          <wp:inline distT="0" distB="0" distL="0" distR="0">
-            <wp:extent cx="2095500" cy="971550"/>
-            <wp:effectExtent t="0" r="0" b="0" l="0"/>
-            <wp:docPr id="1" name="" descr="" title=""/>
-            <wp:cNvGraphicFramePr>
-              <a:graphicFrameLocks xmlns:a="http://schemas.openxmlformats.org/drawingml/2006/main" noChangeAspect="1"/>
-            </wp:cNvGraphicFramePr>
-            <a:graphic xmlns:a="http://schemas.openxmlformats.org/drawingml/2006/main">
-              <a:graphicData uri="http://schemas.openxmlformats.org/drawingml/2006/picture">
-                <pic:pic xmlns:pic="http://schemas.openxmlformats.org/drawingml/2006/picture">
-                  <pic:nvPicPr>
-                    <pic:cNvPr id="0" name="" descr=""/>
-                    <pic:cNvPicPr>
-                      <a:picLocks noChangeAspect="1" noChangeArrowheads="1"/>
-                    </pic:cNvPicPr>
-                  </pic:nvPicPr>
-                  <pic:blipFill>
-                    <a:blip r:embed="rId16" cstate="none"/>
-                    <a:srcRect/>
-                    <a:stretch>
-                      <a:fillRect/>
-                    </a:stretch>
-                  </pic:blipFill>
-                  <pic:spPr bwMode="auto">
-                    <a:xfrm>
-                      <a:off x="0" y="0"/>
-                      <a:ext cx="2095500" cy="971550"/>
-                    </a:xfrm>
-                    <a:prstGeom prst="rect">
-                      <a:avLst/>
-                    </a:prstGeom>
-                  </pic:spPr>
-                </pic:pic>
-              </a:graphicData>
-            </a:graphic>
-          </wp:inline>
-        </w:drawing>
-      </w:r>
-    </w:p>
-    <w:p>
-      <w:pPr>
-        <w:spacing w:after="120"/>
-      </w:pPr>
-      <w:r>
-        <w:rPr>
-          <w:rFonts w:ascii="Georgia" w:cs="Georgia" w:eastAsia="Georgia" w:hAnsi="Georgia"/>
-          <w:color w:val="051C2C"/>
-          <w:sz w:val="36"/>
-          <w:szCs w:val="36"/>
-        </w:rPr>
-        <w:t xml:space="preserve">About ABrighter Research</w:t>
-      </w:r>
-    </w:p>
-    <w:p>
-      <w:pPr>
-        <w:spacing w:after="140" w:line="288"/>
-      </w:pPr>
-      <w:r>
-        <w:rPr>
-          <w:sz w:val="18"/>
-          <w:szCs w:val="18"/>
-        </w:rPr>
-        <w:t xml:space="preserve">ABrighter Research publishes Research Intelligence reports on trade, industry and policy for clients in Vietnam and the region. This report applies the framework of Krungsri Research (2026) to Vietnam, updates the data to 30 June 2026 and extends the analysis of mechanisms and policy options.</w:t>
-      </w:r>
-    </w:p>
-    <w:p>
-      <w:pPr>
-        <w:spacing w:after="100" w:before="400"/>
+        <w:spacing w:after="0"/>
       </w:pPr>
       <w:r>
         <w:rPr>
           <w:b/>
           <w:bCs/>
           <w:color w:val="2251FF"/>
-          <w:spacing w:val="30"/>
+          <w:spacing w:val="40"/>
           <w:sz w:val="15"/>
           <w:szCs w:val="15"/>
         </w:rPr>
+        <w:t xml:space="preserve">ABOUT ABRIGHTER</w:t>
+      </w:r>
+    </w:p>
+    <w:p>
+      <w:pPr>
+        <w:spacing w:after="200"/>
+      </w:pPr>
+      <w:r>
+        <w:rPr>
+          <w:rFonts w:ascii="Georgia" w:cs="Georgia" w:eastAsia="Georgia" w:hAnsi="Georgia"/>
+          <w:color w:val="051C2C"/>
+          <w:sz w:val="44"/>
+          <w:szCs w:val="44"/>
+        </w:rPr>
+        <w:t xml:space="preserve">A brighter future for all customers</w:t>
+      </w:r>
+    </w:p>
+    <w:tbl>
+      <w:tblPr>
+        <w:tblW w:type="dxa" w:w="9638"/>
+        <w:tblBorders>
+          <w:top w:val="none" w:color="FFFFFF" w:sz="0"/>
+          <w:left w:val="none" w:color="FFFFFF" w:sz="0"/>
+          <w:bottom w:val="none" w:color="FFFFFF" w:sz="0"/>
+          <w:right w:val="none" w:color="FFFFFF" w:sz="0"/>
+          <w:insideH w:val="none" w:color="FFFFFF" w:sz="0"/>
+          <w:insideV w:val="none" w:color="FFFFFF" w:sz="0"/>
+        </w:tblBorders>
+      </w:tblPr>
+      <w:tblGrid>
+        <w:gridCol w:w="9638"/>
+      </w:tblGrid>
+      <w:tr>
+        <w:tc>
+          <w:tcPr>
+            <w:tcW w:type="dxa" w:w="9638"/>
+            <w:tcBorders>
+              <w:top w:val="none" w:color="FFFFFF" w:sz="0"/>
+              <w:left w:val="single" w:color="00A9F4" w:sz="36"/>
+              <w:bottom w:val="none" w:color="FFFFFF" w:sz="0"/>
+              <w:right w:val="none" w:color="FFFFFF" w:sz="0"/>
+            </w:tcBorders>
+            <w:shd w:fill="051C2C" w:color="auto" w:val="clear"/>
+            <w:tcMar>
+              <w:top w:type="dxa" w:w="280"/>
+              <w:left w:type="dxa" w:w="320"/>
+              <w:bottom w:type="dxa" w:w="220"/>
+              <w:right w:type="dxa" w:w="320"/>
+            </w:tcMar>
+          </w:tcPr>
+          <w:p>
+            <w:pPr>
+              <w:spacing w:after="60"/>
+            </w:pPr>
+            <w:r>
+              <w:rPr>
+                <w:b/>
+                <w:bCs/>
+                <w:color w:val="00A9F4"/>
+                <w:spacing w:val="40"/>
+                <w:sz w:val="15"/>
+                <w:szCs w:val="15"/>
+              </w:rPr>
+              <w:t xml:space="preserve">OUR PURPOSE</w:t>
+            </w:r>
+          </w:p>
+          <w:p>
+            <w:pPr>
+              <w:spacing w:after="60" w:line="300"/>
+            </w:pPr>
+            <w:r>
+              <w:rPr>
+                <w:rFonts w:ascii="Georgia" w:cs="Georgia" w:eastAsia="Georgia" w:hAnsi="Georgia"/>
+                <w:color w:val="FFFFFF"/>
+                <w:sz w:val="24"/>
+                <w:szCs w:val="24"/>
+              </w:rPr>
+              <w:t xml:space="preserve">Building a brighter future for all customers and doing the right things. Our mission for advisory to clients rests on three words: care, encourage and commitment.</w:t>
+            </w:r>
+          </w:p>
+        </w:tc>
+      </w:tr>
+    </w:tbl>
+    <w:p>
+      <w:pPr>
+        <w:spacing w:after="200"/>
+      </w:pPr>
+    </w:p>
+    <w:p>
+      <w:pPr>
+        <w:spacing w:after="140" w:line="288"/>
+      </w:pPr>
+      <w:r>
+        <w:rPr>
+          <w:sz w:val="19"/>
+          <w:szCs w:val="19"/>
+        </w:rPr>
+        <w:t xml:space="preserve">ABrighter is an advisory team that helps clients build better organisations. We work with public bodies, consumer businesses and companies going through financial and organisational change. Our team is bound by ethics, integrity and honesty. We treat clients, candidates and employees with the respect they deserve. Our strategy is simple: to become a valued partner that helps each client grow more modern, resilient and sustainable.</w:t>
+      </w:r>
+    </w:p>
+    <w:p>
+      <w:pPr>
+        <w:spacing w:after="100" w:before="120"/>
+      </w:pPr>
+      <w:r>
+        <w:rPr>
+          <w:b/>
+          <w:bCs/>
+          <w:color w:val="2251FF"/>
+          <w:spacing w:val="40"/>
+          <w:sz w:val="15"/>
+          <w:szCs w:val="15"/>
+        </w:rPr>
+        <w:t xml:space="preserve">OUR VALUES</w:t>
+      </w:r>
+    </w:p>
+    <w:tbl>
+      <w:tblPr>
+        <w:tblW w:type="dxa" w:w="9638"/>
+        <w:tblBorders>
+          <w:top w:val="none" w:color="FFFFFF" w:sz="0"/>
+          <w:left w:val="none" w:color="FFFFFF" w:sz="0"/>
+          <w:bottom w:val="none" w:color="FFFFFF" w:sz="0"/>
+          <w:right w:val="none" w:color="FFFFFF" w:sz="0"/>
+          <w:insideH w:val="none" w:color="FFFFFF" w:sz="0"/>
+          <w:insideV w:val="none" w:color="FFFFFF" w:sz="0"/>
+        </w:tblBorders>
+      </w:tblPr>
+      <w:tblGrid>
+        <w:gridCol w:w="3212"/>
+        <w:gridCol w:w="3212"/>
+        <w:gridCol w:w="3214"/>
+      </w:tblGrid>
+      <w:tr>
+        <w:tc>
+          <w:tcPr>
+            <w:tcW w:type="dxa" w:w="3212"/>
+            <w:tcBorders>
+              <w:top w:val="single" w:color="051C2C" w:sz="12"/>
+              <w:left w:val="none" w:color="FFFFFF" w:sz="0"/>
+              <w:bottom w:val="none" w:color="FFFFFF" w:sz="0"/>
+              <w:right w:val="single" w:color="FFFFFF" w:sz="24"/>
+            </w:tcBorders>
+            <w:shd w:fill="EEF1F4" w:color="auto" w:val="clear"/>
+            <w:tcMar>
+              <w:top w:type="dxa" w:w="140"/>
+              <w:left w:type="dxa" w:w="180"/>
+              <w:bottom w:type="dxa" w:w="120"/>
+              <w:right w:type="dxa" w:w="160"/>
+            </w:tcMar>
+          </w:tcPr>
+          <w:p>
+            <w:pPr>
+              <w:spacing w:after="60"/>
+            </w:pPr>
+            <w:r>
+              <w:rPr>
+                <w:rFonts w:ascii="Georgia" w:cs="Georgia" w:eastAsia="Georgia" w:hAnsi="Georgia"/>
+                <w:color w:val="2251FF"/>
+                <w:sz w:val="26"/>
+                <w:szCs w:val="26"/>
+              </w:rPr>
+              <w:t xml:space="preserve">Care</w:t>
+            </w:r>
+          </w:p>
+          <w:p>
+            <w:pPr>
+              <w:spacing w:after="0" w:line="252"/>
+            </w:pPr>
+            <w:r>
+              <w:rPr>
+                <w:sz w:val="16"/>
+                <w:szCs w:val="16"/>
+              </w:rPr>
+              <w:t xml:space="preserve">We care about our customers and each other. We serve with humility and transparency.</w:t>
+            </w:r>
+          </w:p>
+        </w:tc>
+        <w:tc>
+          <w:tcPr>
+            <w:tcW w:type="dxa" w:w="3212"/>
+            <w:tcBorders>
+              <w:top w:val="single" w:color="051C2C" w:sz="12"/>
+              <w:left w:val="none" w:color="FFFFFF" w:sz="0"/>
+              <w:bottom w:val="none" w:color="FFFFFF" w:sz="0"/>
+              <w:right w:val="single" w:color="FFFFFF" w:sz="24"/>
+            </w:tcBorders>
+            <w:shd w:fill="EEF1F4" w:color="auto" w:val="clear"/>
+            <w:tcMar>
+              <w:top w:type="dxa" w:w="140"/>
+              <w:left w:type="dxa" w:w="180"/>
+              <w:bottom w:type="dxa" w:w="120"/>
+              <w:right w:type="dxa" w:w="160"/>
+            </w:tcMar>
+          </w:tcPr>
+          <w:p>
+            <w:pPr>
+              <w:spacing w:after="60"/>
+            </w:pPr>
+            <w:r>
+              <w:rPr>
+                <w:rFonts w:ascii="Georgia" w:cs="Georgia" w:eastAsia="Georgia" w:hAnsi="Georgia"/>
+                <w:color w:val="2251FF"/>
+                <w:sz w:val="26"/>
+                <w:szCs w:val="26"/>
+              </w:rPr>
+              <w:t xml:space="preserve">Courage</w:t>
+            </w:r>
+          </w:p>
+          <w:p>
+            <w:pPr>
+              <w:spacing w:after="0" w:line="252"/>
+            </w:pPr>
+            <w:r>
+              <w:rPr>
+                <w:sz w:val="16"/>
+                <w:szCs w:val="16"/>
+              </w:rPr>
+              <w:t xml:space="preserve">We have the courage to step in, speak up and lead by example.</w:t>
+            </w:r>
+          </w:p>
+        </w:tc>
+        <w:tc>
+          <w:tcPr>
+            <w:tcW w:type="dxa" w:w="3214"/>
+            <w:tcBorders>
+              <w:top w:val="single" w:color="051C2C" w:sz="12"/>
+              <w:left w:val="none" w:color="FFFFFF" w:sz="0"/>
+              <w:bottom w:val="none" w:color="FFFFFF" w:sz="0"/>
+              <w:right w:val="single" w:color="FFFFFF" w:sz="24"/>
+            </w:tcBorders>
+            <w:shd w:fill="EEF1F4" w:color="auto" w:val="clear"/>
+            <w:tcMar>
+              <w:top w:type="dxa" w:w="140"/>
+              <w:left w:type="dxa" w:w="180"/>
+              <w:bottom w:type="dxa" w:w="120"/>
+              <w:right w:type="dxa" w:w="160"/>
+            </w:tcMar>
+          </w:tcPr>
+          <w:p>
+            <w:pPr>
+              <w:spacing w:after="60"/>
+            </w:pPr>
+            <w:r>
+              <w:rPr>
+                <w:rFonts w:ascii="Georgia" w:cs="Georgia" w:eastAsia="Georgia" w:hAnsi="Georgia"/>
+                <w:color w:val="2251FF"/>
+                <w:sz w:val="26"/>
+                <w:szCs w:val="26"/>
+              </w:rPr>
+              <w:t xml:space="preserve">Commitment</w:t>
+            </w:r>
+          </w:p>
+          <w:p>
+            <w:pPr>
+              <w:spacing w:after="0" w:line="252"/>
+            </w:pPr>
+            <w:r>
+              <w:rPr>
+                <w:sz w:val="16"/>
+                <w:szCs w:val="16"/>
+              </w:rPr>
+              <w:t xml:space="preserve">We are unwavering in our commitment. We do what is right and work together to get things done.</w:t>
+            </w:r>
+          </w:p>
+        </w:tc>
+      </w:tr>
+    </w:tbl>
+    <w:p>
+      <w:pPr>
+        <w:spacing w:after="100" w:before="280"/>
+      </w:pPr>
+      <w:r>
+        <w:rPr>
+          <w:b/>
+          <w:bCs/>
+          <w:color w:val="2251FF"/>
+          <w:spacing w:val="40"/>
+          <w:sz w:val="15"/>
+          <w:szCs w:val="15"/>
+        </w:rPr>
+        <w:t xml:space="preserve">WHAT WE DO</w:t>
+      </w:r>
+    </w:p>
+    <w:tbl>
+      <w:tblPr>
+        <w:tblW w:type="dxa" w:w="9638"/>
+        <w:tblBorders>
+          <w:top w:val="none" w:color="FFFFFF" w:sz="0"/>
+          <w:left w:val="none" w:color="FFFFFF" w:sz="0"/>
+          <w:bottom w:val="none" w:color="FFFFFF" w:sz="0"/>
+          <w:right w:val="none" w:color="FFFFFF" w:sz="0"/>
+          <w:insideH w:val="none" w:color="FFFFFF" w:sz="0"/>
+          <w:insideV w:val="none" w:color="FFFFFF" w:sz="0"/>
+        </w:tblBorders>
+      </w:tblPr>
+      <w:tblGrid>
+        <w:gridCol w:w="4819"/>
+        <w:gridCol w:w="4819"/>
+      </w:tblGrid>
+      <w:tr>
+        <w:tc>
+          <w:tcPr>
+            <w:tcW w:type="dxa" w:w="4819"/>
+            <w:tcBorders>
+              <w:top w:val="single" w:color="2251FF" w:sz="12"/>
+              <w:left w:val="none" w:color="FFFFFF" w:sz="0"/>
+              <w:bottom w:val="none" w:color="FFFFFF" w:sz="0"/>
+              <w:right w:val="single" w:color="FFFFFF" w:sz="24"/>
+            </w:tcBorders>
+            <w:shd w:fill="EEF3FF" w:color="auto" w:val="clear"/>
+            <w:tcMar>
+              <w:top w:type="dxa" w:w="160"/>
+              <w:left w:type="dxa" w:w="200"/>
+              <w:bottom w:type="dxa" w:w="140"/>
+              <w:right w:type="dxa" w:w="200"/>
+            </w:tcMar>
+          </w:tcPr>
+          <w:p>
+            <w:pPr>
+              <w:spacing w:after="80"/>
+            </w:pPr>
+            <w:r>
+              <w:rPr>
+                <w:b/>
+                <w:bCs/>
+                <w:color w:val="051C2C"/>
+                <w:sz w:val="19"/>
+                <w:szCs w:val="19"/>
+              </w:rPr>
+              <w:t xml:space="preserve">Strategy and finance control</w:t>
+            </w:r>
+          </w:p>
+          <w:p>
+            <w:pPr>
+              <w:pStyle w:val="ListParagraph"/>
+              <w:numPr>
+                <w:ilvl w:val="0"/>
+                <w:numId w:val="2"/>
+              </w:numPr>
+              <w:spacing w:after="40" w:line="252"/>
+            </w:pPr>
+            <w:r>
+              <w:rPr>
+                <w:sz w:val="16"/>
+                <w:szCs w:val="16"/>
+              </w:rPr>
+              <w:t xml:space="preserve">Corporate strategy and management vision</w:t>
+            </w:r>
+          </w:p>
+          <w:p>
+            <w:pPr>
+              <w:pStyle w:val="ListParagraph"/>
+              <w:numPr>
+                <w:ilvl w:val="0"/>
+                <w:numId w:val="2"/>
+              </w:numPr>
+              <w:spacing w:after="40" w:line="252"/>
+            </w:pPr>
+            <w:r>
+              <w:rPr>
+                <w:sz w:val="16"/>
+                <w:szCs w:val="16"/>
+              </w:rPr>
+              <w:t xml:space="preserve">Business portfolio and digital transformation strategy</w:t>
+            </w:r>
+          </w:p>
+          <w:p>
+            <w:pPr>
+              <w:pStyle w:val="ListParagraph"/>
+              <w:numPr>
+                <w:ilvl w:val="0"/>
+                <w:numId w:val="2"/>
+              </w:numPr>
+              <w:spacing w:after="40" w:line="252"/>
+            </w:pPr>
+            <w:r>
+              <w:rPr>
+                <w:sz w:val="16"/>
+                <w:szCs w:val="16"/>
+              </w:rPr>
+              <w:t xml:space="preserve">Accounting, financial operations and management control</w:t>
+            </w:r>
+          </w:p>
+        </w:tc>
+        <w:tc>
+          <w:tcPr>
+            <w:tcW w:type="dxa" w:w="4819"/>
+            <w:tcBorders>
+              <w:top w:val="single" w:color="2251FF" w:sz="12"/>
+              <w:left w:val="none" w:color="FFFFFF" w:sz="0"/>
+              <w:bottom w:val="none" w:color="FFFFFF" w:sz="0"/>
+              <w:right w:val="single" w:color="FFFFFF" w:sz="24"/>
+            </w:tcBorders>
+            <w:shd w:fill="EEF3FF" w:color="auto" w:val="clear"/>
+            <w:tcMar>
+              <w:top w:type="dxa" w:w="160"/>
+              <w:left w:type="dxa" w:w="200"/>
+              <w:bottom w:type="dxa" w:w="140"/>
+              <w:right w:type="dxa" w:w="200"/>
+            </w:tcMar>
+          </w:tcPr>
+          <w:p>
+            <w:pPr>
+              <w:spacing w:after="80"/>
+            </w:pPr>
+            <w:r>
+              <w:rPr>
+                <w:b/>
+                <w:bCs/>
+                <w:color w:val="051C2C"/>
+                <w:sz w:val="19"/>
+                <w:szCs w:val="19"/>
+              </w:rPr>
+              <w:t xml:space="preserve">Human capital management</w:t>
+            </w:r>
+          </w:p>
+          <w:p>
+            <w:pPr>
+              <w:pStyle w:val="ListParagraph"/>
+              <w:numPr>
+                <w:ilvl w:val="0"/>
+                <w:numId w:val="2"/>
+              </w:numPr>
+              <w:spacing w:after="40" w:line="252"/>
+            </w:pPr>
+            <w:r>
+              <w:rPr>
+                <w:sz w:val="16"/>
+                <w:szCs w:val="16"/>
+              </w:rPr>
+              <w:t xml:space="preserve">Talent management</w:t>
+            </w:r>
+          </w:p>
+          <w:p>
+            <w:pPr>
+              <w:pStyle w:val="ListParagraph"/>
+              <w:numPr>
+                <w:ilvl w:val="0"/>
+                <w:numId w:val="2"/>
+              </w:numPr>
+              <w:spacing w:after="40" w:line="252"/>
+            </w:pPr>
+            <w:r>
+              <w:rPr>
+                <w:sz w:val="16"/>
+                <w:szCs w:val="16"/>
+              </w:rPr>
+              <w:t xml:space="preserve">Personal and organisation development</w:t>
+            </w:r>
+          </w:p>
+          <w:p>
+            <w:pPr>
+              <w:pStyle w:val="ListParagraph"/>
+              <w:numPr>
+                <w:ilvl w:val="0"/>
+                <w:numId w:val="2"/>
+              </w:numPr>
+              <w:spacing w:after="40" w:line="252"/>
+            </w:pPr>
+            <w:r>
+              <w:rPr>
+                <w:sz w:val="16"/>
+                <w:szCs w:val="16"/>
+              </w:rPr>
+              <w:t xml:space="preserve">Labour and legal HR</w:t>
+            </w:r>
+          </w:p>
+        </w:tc>
+      </w:tr>
+      <w:tr>
+        <w:tc>
+          <w:tcPr>
+            <w:tcW w:type="dxa" w:w="4819"/>
+            <w:tcBorders>
+              <w:top w:val="single" w:color="2251FF" w:sz="12"/>
+              <w:left w:val="none" w:color="FFFFFF" w:sz="0"/>
+              <w:bottom w:val="none" w:color="FFFFFF" w:sz="0"/>
+              <w:right w:val="single" w:color="FFFFFF" w:sz="24"/>
+            </w:tcBorders>
+            <w:shd w:fill="EEF3FF" w:color="auto" w:val="clear"/>
+            <w:tcMar>
+              <w:top w:type="dxa" w:w="160"/>
+              <w:left w:type="dxa" w:w="200"/>
+              <w:bottom w:type="dxa" w:w="140"/>
+              <w:right w:type="dxa" w:w="200"/>
+            </w:tcMar>
+          </w:tcPr>
+          <w:p>
+            <w:pPr>
+              <w:spacing w:after="80"/>
+            </w:pPr>
+            <w:r>
+              <w:rPr>
+                <w:b/>
+                <w:bCs/>
+                <w:color w:val="051C2C"/>
+                <w:sz w:val="19"/>
+                <w:szCs w:val="19"/>
+              </w:rPr>
+              <w:t xml:space="preserve">Transactions and deals</w:t>
+            </w:r>
+          </w:p>
+          <w:p>
+            <w:pPr>
+              <w:pStyle w:val="ListParagraph"/>
+              <w:numPr>
+                <w:ilvl w:val="0"/>
+                <w:numId w:val="2"/>
+              </w:numPr>
+              <w:spacing w:after="40" w:line="252"/>
+            </w:pPr>
+            <w:r>
+              <w:rPr>
+                <w:sz w:val="16"/>
+                <w:szCs w:val="16"/>
+              </w:rPr>
+              <w:t xml:space="preserve">Value drivers, operating cash flows and net debt</w:t>
+            </w:r>
+          </w:p>
+          <w:p>
+            <w:pPr>
+              <w:pStyle w:val="ListParagraph"/>
+              <w:numPr>
+                <w:ilvl w:val="0"/>
+                <w:numId w:val="2"/>
+              </w:numPr>
+              <w:spacing w:after="40" w:line="252"/>
+            </w:pPr>
+            <w:r>
+              <w:rPr>
+                <w:sz w:val="16"/>
+                <w:szCs w:val="16"/>
+              </w:rPr>
+              <w:t xml:space="preserve">Working capital and quality of earnings review</w:t>
+            </w:r>
+          </w:p>
+          <w:p>
+            <w:pPr>
+              <w:pStyle w:val="ListParagraph"/>
+              <w:numPr>
+                <w:ilvl w:val="0"/>
+                <w:numId w:val="2"/>
+              </w:numPr>
+              <w:spacing w:after="40" w:line="252"/>
+            </w:pPr>
+            <w:r>
+              <w:rPr>
+                <w:sz w:val="16"/>
+                <w:szCs w:val="16"/>
+              </w:rPr>
+              <w:t xml:space="preserve">Pricing, negotiation support and purchase price allocation</w:t>
+            </w:r>
+          </w:p>
+        </w:tc>
+        <w:tc>
+          <w:tcPr>
+            <w:tcW w:type="dxa" w:w="4819"/>
+            <w:tcBorders>
+              <w:top w:val="single" w:color="2251FF" w:sz="12"/>
+              <w:left w:val="none" w:color="FFFFFF" w:sz="0"/>
+              <w:bottom w:val="none" w:color="FFFFFF" w:sz="0"/>
+              <w:right w:val="single" w:color="FFFFFF" w:sz="24"/>
+            </w:tcBorders>
+            <w:shd w:fill="EEF3FF" w:color="auto" w:val="clear"/>
+            <w:tcMar>
+              <w:top w:type="dxa" w:w="160"/>
+              <w:left w:type="dxa" w:w="200"/>
+              <w:bottom w:type="dxa" w:w="140"/>
+              <w:right w:type="dxa" w:w="200"/>
+            </w:tcMar>
+          </w:tcPr>
+          <w:p>
+            <w:pPr>
+              <w:spacing w:after="80"/>
+            </w:pPr>
+            <w:r>
+              <w:rPr>
+                <w:b/>
+                <w:bCs/>
+                <w:color w:val="051C2C"/>
+                <w:sz w:val="19"/>
+                <w:szCs w:val="19"/>
+              </w:rPr>
+              <w:t xml:space="preserve">Marketing and public relations</w:t>
+            </w:r>
+          </w:p>
+          <w:p>
+            <w:pPr>
+              <w:pStyle w:val="ListParagraph"/>
+              <w:numPr>
+                <w:ilvl w:val="0"/>
+                <w:numId w:val="2"/>
+              </w:numPr>
+              <w:spacing w:after="40" w:line="252"/>
+            </w:pPr>
+            <w:r>
+              <w:rPr>
+                <w:sz w:val="16"/>
+                <w:szCs w:val="16"/>
+              </w:rPr>
+              <w:t xml:space="preserve">Corporate branding and repositioning</w:t>
+            </w:r>
+          </w:p>
+          <w:p>
+            <w:pPr>
+              <w:pStyle w:val="ListParagraph"/>
+              <w:numPr>
+                <w:ilvl w:val="0"/>
+                <w:numId w:val="2"/>
+              </w:numPr>
+              <w:spacing w:after="40" w:line="252"/>
+            </w:pPr>
+            <w:r>
+              <w:rPr>
+                <w:sz w:val="16"/>
+                <w:szCs w:val="16"/>
+              </w:rPr>
+              <w:t xml:space="preserve">PR strategy and new product campaigns</w:t>
+            </w:r>
+          </w:p>
+          <w:p>
+            <w:pPr>
+              <w:pStyle w:val="ListParagraph"/>
+              <w:numPr>
+                <w:ilvl w:val="0"/>
+                <w:numId w:val="2"/>
+              </w:numPr>
+              <w:spacing w:after="40" w:line="252"/>
+            </w:pPr>
+            <w:r>
+              <w:rPr>
+                <w:sz w:val="16"/>
+                <w:szCs w:val="16"/>
+              </w:rPr>
+              <w:t xml:space="preserve">Public affairs and advocacy strategy</w:t>
+            </w:r>
+          </w:p>
+        </w:tc>
+      </w:tr>
+    </w:tbl>
+    <w:p>
+      <w:pPr>
+        <w:spacing w:after="100" w:before="280"/>
+      </w:pPr>
+      <w:r>
+        <w:rPr>
+          <w:b/>
+          <w:bCs/>
+          <w:color w:val="2251FF"/>
+          <w:spacing w:val="40"/>
+          <w:sz w:val="15"/>
+          <w:szCs w:val="15"/>
+        </w:rPr>
+        <w:t xml:space="preserve">HOW WE WORK WITH CLIENTS</w:t>
+      </w:r>
+    </w:p>
+    <w:p>
+      <w:pPr>
+        <w:spacing w:after="80" w:line="264"/>
+      </w:pPr>
+      <w:r>
+        <w:rPr>
+          <w:rFonts w:ascii="Georgia" w:cs="Georgia" w:eastAsia="Georgia" w:hAnsi="Georgia"/>
+          <w:color w:val="2251FF"/>
+          <w:sz w:val="24"/>
+          <w:szCs w:val="24"/>
+        </w:rPr>
+        <w:t xml:space="preserve">01  </w:t>
+      </w:r>
+      <w:r>
+        <w:rPr>
+          <w:b/>
+          <w:bCs/>
+          <w:color w:val="051C2C"/>
+          <w:sz w:val="18"/>
+          <w:szCs w:val="18"/>
+        </w:rPr>
+        <w:t xml:space="preserve">Design and implement. </w:t>
+      </w:r>
+      <w:r>
+        <w:rPr>
+          <w:sz w:val="18"/>
+          <w:szCs w:val="18"/>
+        </w:rPr>
+        <w:t xml:space="preserve">We take on the client's needs and build an action plan for a better organisation.</w:t>
+      </w:r>
+    </w:p>
+    <w:p>
+      <w:pPr>
+        <w:spacing w:after="80" w:line="264"/>
+      </w:pPr>
+      <w:r>
+        <w:rPr>
+          <w:rFonts w:ascii="Georgia" w:cs="Georgia" w:eastAsia="Georgia" w:hAnsi="Georgia"/>
+          <w:color w:val="2251FF"/>
+          <w:sz w:val="24"/>
+          <w:szCs w:val="24"/>
+        </w:rPr>
+        <w:t xml:space="preserve">02  </w:t>
+      </w:r>
+      <w:r>
+        <w:rPr>
+          <w:b/>
+          <w:bCs/>
+          <w:color w:val="051C2C"/>
+          <w:sz w:val="18"/>
+          <w:szCs w:val="18"/>
+        </w:rPr>
+        <w:t xml:space="preserve">Define and embed. </w:t>
+      </w:r>
+      <w:r>
+        <w:rPr>
+          <w:sz w:val="18"/>
+          <w:szCs w:val="18"/>
+        </w:rPr>
+        <w:t xml:space="preserve">We embed and sustain the outcomes of the plan and bring best practice into delivery.</w:t>
+      </w:r>
+    </w:p>
+    <w:p>
+      <w:pPr>
+        <w:spacing w:after="80" w:line="264"/>
+      </w:pPr>
+      <w:r>
+        <w:rPr>
+          <w:rFonts w:ascii="Georgia" w:cs="Georgia" w:eastAsia="Georgia" w:hAnsi="Georgia"/>
+          <w:color w:val="2251FF"/>
+          <w:sz w:val="24"/>
+          <w:szCs w:val="24"/>
+        </w:rPr>
+        <w:t xml:space="preserve">03  </w:t>
+      </w:r>
+      <w:r>
+        <w:rPr>
+          <w:b/>
+          <w:bCs/>
+          <w:color w:val="051C2C"/>
+          <w:sz w:val="18"/>
+          <w:szCs w:val="18"/>
+        </w:rPr>
+        <w:t xml:space="preserve">Mature and evolve. </w:t>
+      </w:r>
+      <w:r>
+        <w:rPr>
+          <w:sz w:val="18"/>
+          <w:szCs w:val="18"/>
+        </w:rPr>
+        <w:t xml:space="preserve">We keep moving with each client as a real partner, assessing and improving as conditions change.</w:t>
+      </w:r>
+    </w:p>
+    <w:p>
+      <w:pPr>
+        <w:spacing w:after="80" w:before="300"/>
+      </w:pPr>
+      <w:r>
+        <w:rPr>
+          <w:b/>
+          <w:bCs/>
+          <w:color w:val="6B7785"/>
+          <w:spacing w:val="30"/>
+          <w:sz w:val="14"/>
+          <w:szCs w:val="14"/>
+        </w:rPr>
         <w:t xml:space="preserve">DISCLAIMER</w:t>
       </w:r>
     </w:p>
@@ -16894,10 +17672,10 @@
       <w:r>
         <w:rPr>
           <w:color w:val="6B7785"/>
-          <w:sz w:val="16"/>
-          <w:szCs w:val="16"/>
-        </w:rPr>
-        <w:t xml:space="preserve">This document is provided for information only. It is based on public sources believed to be reliable at the time of writing. ABrighter Research does not warrant their accuracy or completeness. Illustrative calculations rest on stated assumptions and are not forecasts. Nothing in this report is investment, legal or tax advice. Readers should verify figures against primary sources before relying on them.</w:t>
+          <w:sz w:val="14"/>
+          <w:szCs w:val="14"/>
+        </w:rPr>
+        <w:t xml:space="preserve">This document is provided for information only. It is based on public sources believed to be reliable at the time of writing. ABrighter does not warrant their accuracy or completeness. Scenarios rest on stated assumptions and are not forecasts. Nothing in this report is investment, legal or tax advice. Readers should verify figures against primary sources before relying on them.</w:t>
       </w:r>
     </w:p>
     <w:p>
@@ -16943,7 +17721,7 @@
                     </pic:cNvPicPr>
                   </pic:nvPicPr>
                   <pic:blipFill>
-                    <a:blip r:embed="rId26" cstate="none"/>
+                    <a:blip r:embed="rId37" cstate="none"/>
                     <a:srcRect/>
                     <a:stretch>
                       <a:fillRect/>
@@ -17343,7 +18121,7 @@
           <w:sz w:val="14"/>
           <w:szCs w:val="14"/>
         </w:rPr>
-        <w:t xml:space="preserve">NSO, socio-economic situation in June and the first half of 2026 (July 2026): exports USD 266.52 billion (+21%), imports USD 283.17 billion (+33.4%), deficit USD 16.65 billion; imports from China USD 115.2 billion.</w:t>
+        <w:t xml:space="preserve">UNCTAD and World Bank (2018), The Unseen Impact of Non-Tariff Measures: Insights from a New Database. Simple average AVEs for 40 importing and 200 exporting economies.</w:t>
       </w:r>
     </w:p>
   </w:footnote>
@@ -17365,7 +18143,7 @@
           <w:sz w:val="14"/>
           <w:szCs w:val="14"/>
         </w:rPr>
-        <w:t xml:space="preserve">UNCTAD and World Bank (2018), The Unseen Impact of Non-Tariff Measures: Insights from a New Database. Simple average AVEs for 40 importing and 200 exporting economies.</w:t>
+        <w:t xml:space="preserve">NSO and Customs data for 2025 as reported by Vietnam News Agency (January 2026): eight items above USD 10 billion accounted for 70.2% of exports.</w:t>
       </w:r>
     </w:p>
   </w:footnote>
@@ -17387,7 +18165,7 @@
           <w:sz w:val="14"/>
           <w:szCs w:val="14"/>
         </w:rPr>
-        <w:t xml:space="preserve">NSO and Customs data for 2025 as reported by Vietnam News Agency (January 2026): eight items above USD 10 billion accounted for 70.2% of exports.</w:t>
+        <w:t xml:space="preserve">Krungsri Research (September 2026), Non-Tariff Measures: Impacts and Challenges on ASEAN. Figures 4 to 6 and Tables 1 and 2 draw on CEIC and Trade Map (2024).</w:t>
       </w:r>
     </w:p>
   </w:footnote>
@@ -17409,7 +18187,7 @@
           <w:sz w:val="14"/>
           <w:szCs w:val="14"/>
         </w:rPr>
-        <w:t xml:space="preserve">Krungsri Research (September 2026), Non-Tariff Measures: Impacts and Challenges on ASEAN. Figures 4 to 6 and Tables 1 and 2 draw on CEIC and Trade Map (2024).</w:t>
+        <w:t xml:space="preserve">Ministry of Industry and Trade (MOIT), as reported by Vietnam News Agency (2026): exports to the EU USD 56.2 billion (+8.6%), imports USD 17.6 billion, surplus USD 38.6 billion in 2025.</w:t>
       </w:r>
     </w:p>
   </w:footnote>
@@ -17431,7 +18209,7 @@
           <w:sz w:val="14"/>
           <w:szCs w:val="14"/>
         </w:rPr>
-        <w:t xml:space="preserve">Ministry of Industry and Trade (MOIT), as reported by Vietnam News Agency (2026): exports to the EU USD 56.2 billion (+8.6%), imports USD 17.6 billion, surplus USD 38.6 billion in 2025.</w:t>
+        <w:t xml:space="preserve">MOIT Go Global, EU market bulletin for Q2 2026 (August 2026): exports to the EU USD 31.786 billion in H1 2026 (+16.3%), of which USD 16.72 billion in Q2.</w:t>
       </w:r>
     </w:p>
   </w:footnote>
@@ -17453,7 +18231,7 @@
           <w:sz w:val="14"/>
           <w:szCs w:val="14"/>
         </w:rPr>
-        <w:t xml:space="preserve">MOIT Go Global, EU market bulletin for Q2 2026 (August 2026): exports to the EU USD 31.786 billion in H1 2026 (+16.3%), of which USD 16.72 billion in Q2.</w:t>
+        <w:t xml:space="preserve">National Statistics Office (NSO), Ministry of Finance, socio-economic report for 2025 (January 2026): GDP growth 8.02%, GDP about USD 514 billion.</w:t>
       </w:r>
     </w:p>
   </w:footnote>
@@ -17475,7 +18253,7 @@
           <w:sz w:val="14"/>
           <w:szCs w:val="14"/>
         </w:rPr>
-        <w:t xml:space="preserve">National Statistics Office (NSO), Ministry of Finance, socio-economic report for 2025 (January 2026): GDP growth 8.02%, GDP about USD 514 billion.</w:t>
+        <w:t xml:space="preserve">Ministry of Industry and Trade (MOIT), as reported by Vietnam News Agency (2026): exports to the EU USD 56.2 billion (+8.6%), imports USD 17.6 billion, surplus USD 38.6 billion in 2025.</w:t>
       </w:r>
     </w:p>
   </w:footnote>
@@ -17497,7 +18275,7 @@
           <w:sz w:val="14"/>
           <w:szCs w:val="14"/>
         </w:rPr>
-        <w:t xml:space="preserve">Ministry of Industry and Trade (MOIT), as reported by Vietnam News Agency (2026): exports to the EU USD 56.2 billion (+8.6%), imports USD 17.6 billion, surplus USD 38.6 billion in 2025.</w:t>
+        <w:t xml:space="preserve">Regulation (EU) 2025/2083 (CBAM Omnibus), in force 20 October 2025; EY Global Tax Alert (22 October 2025).</w:t>
       </w:r>
     </w:p>
   </w:footnote>
@@ -17519,7 +18297,7 @@
           <w:sz w:val="14"/>
           <w:szCs w:val="14"/>
         </w:rPr>
-        <w:t xml:space="preserve">Regulation (EU) 2025/2083 (CBAM Omnibus), in force 20 October 2025; EY Global Tax Alert (22 October 2025).</w:t>
+        <w:t xml:space="preserve">Directive 2003/87/EC as amended by Directive (EU) 2023/959, Article 10a(1a): CBAM factor of 97.5% in 2026 falling to zero in 2034.</w:t>
       </w:r>
     </w:p>
   </w:footnote>
@@ -17541,7 +18319,7 @@
           <w:sz w:val="14"/>
           <w:szCs w:val="14"/>
         </w:rPr>
-        <w:t xml:space="preserve">Directive 2003/87/EC as amended by Directive (EU) 2023/959, Article 10a(1a): CBAM factor of 97.5% in 2026 falling to zero in 2034.</w:t>
+        <w:t xml:space="preserve">Commission implementing acts on CBAM default values (December 2025), summarised by RMIT Vietnam (January 2026) and MOIT (2026).</w:t>
       </w:r>
     </w:p>
   </w:footnote>
@@ -17563,7 +18341,7 @@
           <w:sz w:val="14"/>
           <w:szCs w:val="14"/>
         </w:rPr>
-        <w:t xml:space="preserve">Commission implementing acts on CBAM default values (December 2025), summarised by RMIT Vietnam (January 2026) and MOIT (2026).</w:t>
+        <w:t xml:space="preserve">Krungsri Research (September 2026), Non-Tariff Measures: Impacts and Challenges on ASEAN. Figures 4 to 6 and Tables 1 and 2 draw on CEIC and Trade Map (2024).</w:t>
       </w:r>
     </w:p>
   </w:footnote>
@@ -17585,7 +18363,7 @@
           <w:sz w:val="14"/>
           <w:szCs w:val="14"/>
         </w:rPr>
-        <w:t xml:space="preserve">Krungsri Research (September 2026), Non-Tariff Measures: Impacts and Challenges on ASEAN. Figures 4 to 6 and Tables 1 and 2 draw on CEIC and Trade Map (2024).</w:t>
+        <w:t xml:space="preserve">European Commission proposal COM(2025) 989 of 17 December 2025 to extend CBAM to downstream goods; Mayer Brown (18 December 2025).</w:t>
       </w:r>
     </w:p>
   </w:footnote>
@@ -17607,7 +18385,7 @@
           <w:sz w:val="14"/>
           <w:szCs w:val="14"/>
         </w:rPr>
-        <w:t xml:space="preserve">European Commission proposal COM(2025) 989 of 17 December 2025 to extend CBAM to downstream goods; Mayer Brown (18 December 2025).</w:t>
+        <w:t xml:space="preserve">Vietstock (November 2025), How Vietnam can ensure greener steel, citing industry estimates: 2.51 tCO2 per tonne of crude steel in Vietnam against a global average of 1.85.</w:t>
       </w:r>
     </w:p>
   </w:footnote>
@@ -17629,7 +18407,7 @@
           <w:sz w:val="14"/>
           <w:szCs w:val="14"/>
         </w:rPr>
-        <w:t xml:space="preserve">Vietstock (November 2025), How Vietnam can ensure greener steel, citing industry estimates: 2.51 tCO2 per tonne of crude steel in Vietnam against a global average of 1.85.</w:t>
+        <w:t xml:space="preserve">VSA via The Investor (January 2026): crude steel output of 24.7 million tonnes in 2025 (+12%).</w:t>
       </w:r>
     </w:p>
   </w:footnote>
@@ -17651,7 +18429,7 @@
           <w:sz w:val="14"/>
           <w:szCs w:val="14"/>
         </w:rPr>
-        <w:t xml:space="preserve">VSA via The Investor (January 2026): crude steel output of 24.7 million tonnes in 2025 (+12%).</w:t>
+        <w:t xml:space="preserve">Vietnam Steel Association (VSA) data for 2025 as reported by the WTO Integration Centre of VCCI (2026): 10.06 million tonnes worth USD 6.63 billion; EU about 2.08 million tonnes and close to USD 1.4 billion.</w:t>
       </w:r>
     </w:p>
   </w:footnote>
@@ -17673,7 +18451,7 @@
           <w:sz w:val="14"/>
           <w:szCs w:val="14"/>
         </w:rPr>
-        <w:t xml:space="preserve">Vietnam Steel Association (VSA) data for 2025 as reported by the WTO Integration Centre of VCCI (2026): 10.06 million tonnes worth USD 6.63 billion; EU about 2.08 million tonnes and close to USD 1.4 billion.</w:t>
+        <w:t xml:space="preserve">GMK Center (May to July 2026) and Carbon Pulse (July 2026): EUAs above EUR 90/t in January 2026, EUR 74 to 79/t in May 2026; 2026 average of EUR 78.27/t to 31 August 2026.</w:t>
       </w:r>
     </w:p>
   </w:footnote>
@@ -17695,7 +18473,7 @@
           <w:sz w:val="14"/>
           <w:szCs w:val="14"/>
         </w:rPr>
-        <w:t xml:space="preserve">GMK Center (May to July 2026) and Carbon Pulse (July 2026): EUAs above EUR 90/t in January 2026, EUR 74 to 79/t in May 2026; 2026 average of EUR 78.27/t to 31 August 2026.</w:t>
+        <w:t xml:space="preserve">Regulation (EU) 2025/2650 amending the EUDR (December 2025); European Commission report COM(2026) 191 of 4 May 2026.</w:t>
       </w:r>
     </w:p>
   </w:footnote>
@@ -17717,7 +18495,7 @@
           <w:sz w:val="14"/>
           <w:szCs w:val="14"/>
         </w:rPr>
-        <w:t xml:space="preserve">Regulation (EU) 2025/2650 amending the EUDR (December 2025); European Commission report COM(2026) 191 of 4 May 2026.</w:t>
+        <w:t xml:space="preserve">Krungsri Research (September 2026), Non-Tariff Measures: Impacts and Challenges on ASEAN. Figures 4 to 6 and Tables 1 and 2 draw on CEIC and Trade Map (2024).</w:t>
       </w:r>
     </w:p>
   </w:footnote>
@@ -17739,7 +18517,7 @@
           <w:sz w:val="14"/>
           <w:szCs w:val="14"/>
         </w:rPr>
-        <w:t xml:space="preserve">Krungsri Research (September 2026), Non-Tariff Measures: Impacts and Challenges on ASEAN. Figures 4 to 6 and Tables 1 and 2 draw on CEIC and Trade Map (2024).</w:t>
+        <w:t xml:space="preserve">Vietnam Coffee and Cocoa Association (VICOFA) and Customs data for 2025: about 1.6 million tonnes, USD 8.92 billion (+58.8% in value).</w:t>
       </w:r>
     </w:p>
   </w:footnote>
@@ -17761,7 +18539,7 @@
           <w:sz w:val="14"/>
           <w:szCs w:val="14"/>
         </w:rPr>
-        <w:t xml:space="preserve">Vietnam Coffee and Cocoa Association (VICOFA) and Customs data for 2025: about 1.6 million tonnes, USD 8.92 billion (+58.8% in value).</w:t>
+        <w:t xml:space="preserve">Vietnam Timber and Forest Products Association data reported by Vietnam News (2026): record exports of USD 17.2 billion for wood and forest products; direct exports to the EU at around 4.8% to 5.2%.</w:t>
       </w:r>
     </w:p>
   </w:footnote>
@@ -17783,7 +18561,7 @@
           <w:sz w:val="14"/>
           <w:szCs w:val="14"/>
         </w:rPr>
-        <w:t xml:space="preserve">Vietnam Timber and Forest Products Association data reported by Vietnam News (2026): record exports of USD 17.2 billion for wood and forest products; direct exports to the EU at around 4.8% to 5.2%.</w:t>
+        <w:t xml:space="preserve">Vietnam Rubber Association (VRA), December 2025: industry exports about USD 11 billion including processed products and rubberwood; the EU took 7.4% of rubber export value.</w:t>
       </w:r>
     </w:p>
   </w:footnote>
@@ -17805,7 +18583,7 @@
           <w:sz w:val="14"/>
           <w:szCs w:val="14"/>
         </w:rPr>
-        <w:t xml:space="preserve">Vietnam Rubber Association (VRA), December 2025: industry exports about USD 11 billion including processed products and rubberwood; the EU took 7.4% of rubber export value.</w:t>
+        <w:t xml:space="preserve">Commission Implementing Regulation (EU) 2025/1093 on country benchmarking (May 2025); Ministry of Agriculture and Environment (MAE), May 2025.</w:t>
       </w:r>
     </w:p>
   </w:footnote>
@@ -17827,7 +18605,7 @@
           <w:sz w:val="14"/>
           <w:szCs w:val="14"/>
         </w:rPr>
-        <w:t xml:space="preserve">Commission Implementing Regulation (EU) 2025/1093 on country benchmarking (May 2025); Ministry of Agriculture and Environment (MAE), May 2025.</w:t>
+        <w:t xml:space="preserve">MAE Forestry and Forest Protection Department action plan on EUDR adaptation, reported by Vietnam News (February 2026).</w:t>
       </w:r>
     </w:p>
   </w:footnote>
@@ -17849,7 +18627,7 @@
           <w:sz w:val="14"/>
           <w:szCs w:val="14"/>
         </w:rPr>
-        <w:t xml:space="preserve">MAE Forestry and Forest Protection Department action plan on EUDR adaptation, reported by Vietnam News (February 2026).</w:t>
+        <w:t xml:space="preserve">Vietnam Rubber Group (VRG) as reported by Nong nghiep va Moi truong (July 2026): about 10,000 tonnes of EUDR-compliant rubber sold in 2025 and H1 2026 at a premium of USD 120 to 250 per tonne.</w:t>
       </w:r>
     </w:p>
   </w:footnote>
@@ -17871,7 +18649,7 @@
           <w:sz w:val="14"/>
           <w:szCs w:val="14"/>
         </w:rPr>
-        <w:t xml:space="preserve">Vietnam Rubber Group (VRG) as reported by Nong nghiep va Moi truong (July 2026): about 10,000 tonnes of EUDR-compliant rubber sold in 2025 and H1 2026 at a premium of USD 120 to 250 per tonne.</w:t>
+        <w:t xml:space="preserve">Decision 232/QD-TTg (2025) on the carbon market and Decision 263/QD-TTg on allowances for 2025 and 2026; ICAP (2025).</w:t>
       </w:r>
     </w:p>
   </w:footnote>
@@ -17893,7 +18671,7 @@
           <w:sz w:val="14"/>
           <w:szCs w:val="14"/>
         </w:rPr>
-        <w:t xml:space="preserve">Decision 232/QD-TTg (2025) on the carbon market and Decision 263/QD-TTg on allowances for 2025 and 2026; ICAP (2025).</w:t>
+        <w:t xml:space="preserve">Regulation (EU) 2023/956, Article 9: reduction for the carbon price effectively paid in the country of origin.</w:t>
       </w:r>
     </w:p>
   </w:footnote>
@@ -17915,33 +18693,11 @@
           <w:sz w:val="14"/>
           <w:szCs w:val="14"/>
         </w:rPr>
-        <w:t xml:space="preserve">Regulation (EU) 2023/956, Article 9: reduction for the carbon price effectively paid in the country of origin.</w:t>
+        <w:t xml:space="preserve">MOIT (2026): Vietnam is the EU's largest trading partner in ASEAN.</w:t>
       </w:r>
     </w:p>
   </w:footnote>
   <w:footnote w:id="38">
-    <w:p>
-      <w:pPr>
-        <w:spacing w:after="0"/>
-      </w:pPr>
-      <w:r>
-        <w:rPr>
-          <w:rStyle w:val="FootnoteReference"/>
-        </w:rPr>
-        <w:footnoteRef/>
-      </w:r>
-      <w:r>
-        <w:rPr>
-          <w:rFonts w:ascii="Arial" w:cs="Arial" w:eastAsia="Arial" w:hAnsi="Arial"/>
-          <w:color w:val="6B7785"/>
-          <w:sz w:val="14"/>
-          <w:szCs w:val="14"/>
-        </w:rPr>
-        <w:t xml:space="preserve">MOIT (2026): Vietnam is the EU's largest trading partner in ASEAN.</w:t>
-      </w:r>
-    </w:p>
-  </w:footnote>
-  <w:footnote w:id="39">
     <w:p>
       <w:pPr>
         <w:spacing w:after="0"/>

</xml_diff>